<commit_message>
Paso 2: nueva pestaña «En cada departamento» y píldora del paso 2 sin cortar
Seis departamentos (hoy, con Claude en Chrome, qué ganamos y lo que nunca),
escalera de cuatro niveles de acceso, barreras de seguridad y cómo lo
mediremos. Normas 8 a 10 nuevas. Se publican departamentos-y-niveles.md y
las normas actualizadas; COMO-CREAR-EL-PROYECTO.md sin el apartado de
Claude Code. La barra de pestañas cabe entera desde 1366 px.

Co-Authored-By: Claude Opus 5.5 <noreply@anthropic.com>
</commit_message>
<xml_diff>
--- a/descargas/Transformacion-IA-Reynasa.docx
+++ b/descargas/Transformacion-IA-Reynasa.docx
@@ -46,7 +46,7 @@
                 <wp:inline distT="0" distB="0" distL="0" distR="0">
                   <wp:extent cx="1495425" cy="371475"/>
                   <wp:effectExtent t="0" r="0" b="0" l="0"/>
-                  <wp:docPr id="16" name="reynasa" descr="reynasa" title="reynasa"/>
+                  <wp:docPr id="17" name="reynasa" descr="reynasa" title="reynasa"/>
                   <wp:cNvGraphicFramePr>
                     <a:graphicFrameLocks xmlns:a="http://schemas.openxmlformats.org/drawingml/2006/main" noChangeAspect="1"/>
                   </wp:cNvGraphicFramePr>
@@ -106,7 +106,7 @@
                 <wp:inline distT="0" distB="0" distL="0" distR="0">
                   <wp:extent cx="1485900" cy="323850"/>
                   <wp:effectExtent t="0" r="0" b="0" l="0"/>
-                  <wp:docPr id="17" name="claude" descr="claude" title="claude"/>
+                  <wp:docPr id="18" name="claude" descr="claude" title="claude"/>
                   <wp:cNvGraphicFramePr>
                     <a:graphicFrameLocks xmlns:a="http://schemas.openxmlformats.org/drawingml/2006/main" noChangeAspect="1"/>
                   </wp:cNvGraphicFramePr>
@@ -154,7 +154,7 @@
           <wp:inline distT="0" distB="0" distL="0" distR="0">
             <wp:extent cx="6096000" cy="3448050"/>
             <wp:effectExtent t="0" r="0" b="0" l="0"/>
-            <wp:docPr id="18" name="Portada" descr="Portada" title="Portada"/>
+            <wp:docPr id="19" name="Portada" descr="Portada" title="Portada"/>
             <wp:cNvGraphicFramePr>
               <a:graphicFrameLocks xmlns:a="http://schemas.openxmlformats.org/drawingml/2006/main" noChangeAspect="1"/>
             </wp:cNvGraphicFramePr>
@@ -700,7 +700,7 @@
           <w:sz w:val="23"/>
           <w:szCs w:val="23"/>
         </w:rPr>
-        <w:t xml:space="preserve">Presentación</w:t>
+        <w:t xml:space="preserve">En cada departamento</w:t>
       </w:r>
       <w:r>
         <w:rPr>
@@ -708,7 +708,7 @@
           <w:sz w:val="18"/>
           <w:szCs w:val="18"/>
         </w:rPr>
-        <w:t xml:space="preserve">   Cómo funciona Claude en Chrome dentro de Sage X3, diapositiva a diapositiva.</w:t>
+        <w:t xml:space="preserve">   Lo que más se hace en Sage es buscar información. Justo lo que Claude en Chrome hace bien y sin riesgo.</w:t>
       </w:r>
     </w:p>
     <w:p>
@@ -735,7 +735,7 @@
           <w:sz w:val="23"/>
           <w:szCs w:val="23"/>
         </w:rPr>
-        <w:t xml:space="preserve">Pantallas a la vez</w:t>
+        <w:t xml:space="preserve">Presentación</w:t>
       </w:r>
       <w:r>
         <w:rPr>
@@ -743,7 +743,7 @@
           <w:sz w:val="18"/>
           <w:szCs w:val="18"/>
         </w:rPr>
-        <w:t xml:space="preserve">   Lo hemos medido en Sage: es lo que ya hace la gran mayoría de la plantilla.</w:t>
+        <w:t xml:space="preserve">   Cómo funciona Claude en Chrome dentro de Sage X3, diapositiva a diapositiva.</w:t>
       </w:r>
     </w:p>
     <w:p>
@@ -770,7 +770,7 @@
           <w:sz w:val="23"/>
           <w:szCs w:val="23"/>
         </w:rPr>
-        <w:t xml:space="preserve">Proyecto y reglas</w:t>
+        <w:t xml:space="preserve">Pantallas a la vez</w:t>
       </w:r>
       <w:r>
         <w:rPr>
@@ -778,7 +778,7 @@
           <w:sz w:val="18"/>
           <w:szCs w:val="18"/>
         </w:rPr>
-        <w:t xml:space="preserve">   Claude en Chrome se usa siempre desde un proyecto de Claude con normas que lee al empezar.</w:t>
+        <w:t xml:space="preserve">   Lo hemos medido en Sage: es lo que ya hace la gran mayoría de la plantilla.</w:t>
       </w:r>
     </w:p>
     <w:p>
@@ -805,7 +805,7 @@
           <w:sz w:val="23"/>
           <w:szCs w:val="23"/>
         </w:rPr>
-        <w:t xml:space="preserve">Fases</w:t>
+        <w:t xml:space="preserve">Proyecto y reglas</w:t>
       </w:r>
       <w:r>
         <w:rPr>
@@ -813,7 +813,7 @@
           <w:sz w:val="18"/>
           <w:szCs w:val="18"/>
         </w:rPr>
-        <w:t xml:space="preserve">   Empezamos solo consultando. Cada paso más lo aprueba IT.</w:t>
+        <w:t xml:space="preserve">   Claude en Chrome se usa siempre desde un proyecto de Claude con normas que lee al empezar.</w:t>
       </w:r>
     </w:p>
     <w:p>
@@ -840,7 +840,7 @@
           <w:sz w:val="23"/>
           <w:szCs w:val="23"/>
         </w:rPr>
-        <w:t xml:space="preserve">Normas</w:t>
+        <w:t xml:space="preserve">Fases</w:t>
       </w:r>
       <w:r>
         <w:rPr>
@@ -848,7 +848,7 @@
           <w:sz w:val="18"/>
           <w:szCs w:val="18"/>
         </w:rPr>
-        <w:t xml:space="preserve">   Sencillas y para todo el personal.</w:t>
+        <w:t xml:space="preserve">   Empezamos solo consultando. Cada paso más lo aprueba IT.</w:t>
       </w:r>
     </w:p>
     <w:p>
@@ -867,6 +867,41 @@
           <w:szCs w:val="18"/>
         </w:rPr>
         <w:t xml:space="preserve">2.7    </w:t>
+      </w:r>
+      <w:r>
+        <w:rPr>
+          <w:b/>
+          <w:bCs/>
+          <w:sz w:val="23"/>
+          <w:szCs w:val="23"/>
+        </w:rPr>
+        <w:t xml:space="preserve">Normas</w:t>
+      </w:r>
+      <w:r>
+        <w:rPr>
+          <w:color w:val="4A5466"/>
+          <w:sz w:val="18"/>
+          <w:szCs w:val="18"/>
+        </w:rPr>
+        <w:t xml:space="preserve">   Sencillas y para todo el personal.</w:t>
+      </w:r>
+    </w:p>
+    <w:p>
+      <w:pPr>
+        <w:pBdr>
+          <w:bottom w:val="single" w:color="DDE0E5" w:sz="4"/>
+        </w:pBdr>
+        <w:spacing w:after="70"/>
+      </w:pPr>
+      <w:r>
+        <w:rPr>
+          <w:b/>
+          <w:bCs/>
+          <w:color w:val="004A98"/>
+          <w:sz w:val="18"/>
+          <w:szCs w:val="18"/>
+        </w:rPr>
+        <w:t xml:space="preserve">2.8    </w:t>
       </w:r>
       <w:r>
         <w:rPr>
@@ -5930,7 +5965,7 @@
           <w:sz w:val="16"/>
           <w:szCs w:val="16"/>
         </w:rPr>
-        <w:t xml:space="preserve">PASO 2 · CLAUDE EN CHROME EN SAGE · 1 DE 7</w:t>
+        <w:t xml:space="preserve">PASO 2 · CLAUDE EN CHROME EN SAGE · 1 DE 8</w:t>
       </w:r>
     </w:p>
     <w:p>
@@ -6407,7 +6442,2755 @@
           <w:sz w:val="16"/>
           <w:szCs w:val="16"/>
         </w:rPr>
-        <w:t xml:space="preserve">PASO 2 · CLAUDE EN CHROME EN SAGE · 2 DE 7</w:t>
+        <w:t xml:space="preserve">PASO 2 · CLAUDE EN CHROME EN SAGE · 2 DE 8</w:t>
+      </w:r>
+    </w:p>
+    <w:p>
+      <w:pPr>
+        <w:pStyle w:val="Heading1"/>
+      </w:pPr>
+      <w:r>
+        <w:t xml:space="preserve">Claude en Chrome en cada departamento</w:t>
+      </w:r>
+    </w:p>
+    <w:p>
+      <w:pPr>
+        <w:spacing w:after="240" w:line="320"/>
+      </w:pPr>
+      <w:r>
+        <w:rPr>
+          <w:color w:val="4A5466"/>
+          <w:sz w:val="25"/>
+          <w:szCs w:val="25"/>
+        </w:rPr>
+        <w:t xml:space="preserve">Lo que más se hace en Sage es buscar información. Justo lo que Claude en Chrome hace bien y sin riesgo.</w:t>
+      </w:r>
+    </w:p>
+    <w:p>
+      <w:pPr>
+        <w:spacing w:after="240"/>
+      </w:pPr>
+      <w:r>
+        <w:drawing>
+          <wp:inline distT="0" distB="0" distL="0" distR="0">
+            <wp:extent cx="6096000" cy="3448050"/>
+            <wp:effectExtent t="0" r="0" b="0" l="0"/>
+            <wp:docPr id="10" name="Claude en Chrome en cada departamento" descr="Claude en Chrome en cada departamento" title="Claude en Chrome en cada departamento"/>
+            <wp:cNvGraphicFramePr>
+              <a:graphicFrameLocks xmlns:a="http://schemas.openxmlformats.org/drawingml/2006/main" noChangeAspect="1"/>
+            </wp:cNvGraphicFramePr>
+            <a:graphic xmlns:a="http://schemas.openxmlformats.org/drawingml/2006/main">
+              <a:graphicData uri="http://schemas.openxmlformats.org/drawingml/2006/picture">
+                <pic:pic xmlns:pic="http://schemas.openxmlformats.org/drawingml/2006/picture">
+                  <pic:nvPicPr>
+                    <pic:cNvPr id="0" name="" descr=""/>
+                    <pic:cNvPicPr>
+                      <a:picLocks noChangeAspect="1" noChangeArrowheads="1"/>
+                    </pic:cNvPicPr>
+                  </pic:nvPicPr>
+                  <pic:blipFill>
+                    <a:blip r:embed="rId16" cstate="none"/>
+                    <a:srcRect/>
+                    <a:stretch>
+                      <a:fillRect/>
+                    </a:stretch>
+                  </pic:blipFill>
+                  <pic:spPr bwMode="auto">
+                    <a:xfrm>
+                      <a:off x="0" y="0"/>
+                      <a:ext cx="6096000" cy="3448050"/>
+                    </a:xfrm>
+                    <a:prstGeom prst="rect">
+                      <a:avLst/>
+                    </a:prstGeom>
+                  </pic:spPr>
+                </pic:pic>
+              </a:graphicData>
+            </a:graphic>
+          </wp:inline>
+        </w:drawing>
+      </w:r>
+    </w:p>
+    <w:p>
+      <w:pPr>
+        <w:pStyle w:val="Heading2"/>
+      </w:pPr>
+      <w:r>
+        <w:t xml:space="preserve">Seis departamentos</w:t>
+      </w:r>
+    </w:p>
+    <w:tbl>
+      <w:tblPr>
+        <w:tblW w:type="dxa" w:w="9638"/>
+        <w:tblBorders>
+          <w:top w:val="single" w:color="auto" w:sz="4"/>
+          <w:left w:val="single" w:color="auto" w:sz="4"/>
+          <w:bottom w:val="single" w:color="auto" w:sz="4"/>
+          <w:right w:val="single" w:color="auto" w:sz="4"/>
+          <w:insideH w:val="single" w:color="auto" w:sz="4"/>
+          <w:insideV w:val="single" w:color="auto" w:sz="4"/>
+        </w:tblBorders>
+      </w:tblPr>
+      <w:tblGrid>
+        <w:gridCol w:w="9638"/>
+      </w:tblGrid>
+      <w:tr>
+        <w:trPr>
+          <w:cantSplit/>
+        </w:trPr>
+        <w:tc>
+          <w:tcPr>
+            <w:tcW w:type="dxa" w:w="9638"/>
+            <w:tcBorders>
+              <w:top w:val="none" w:color="FFFFFF" w:sz="0"/>
+              <w:left w:val="single" w:color="004A98" w:sz="24"/>
+              <w:bottom w:val="none" w:color="FFFFFF" w:sz="0"/>
+              <w:right w:val="none" w:color="FFFFFF" w:sz="0"/>
+            </w:tcBorders>
+            <w:shd w:fill="E8EFF8" w:color="auto" w:val="clear"/>
+            <w:tcMar>
+              <w:top w:type="dxa" w:w="140"/>
+              <w:left w:type="dxa" w:w="220"/>
+              <w:bottom w:type="dxa" w:w="140"/>
+              <w:right w:type="dxa" w:w="220"/>
+            </w:tcMar>
+          </w:tcPr>
+          <w:p>
+            <w:pPr>
+              <w:spacing w:after="80" w:line="300"/>
+            </w:pPr>
+            <w:r>
+              <w:rPr>
+                <w:b/>
+                <w:bCs/>
+                <w:color w:val="004A98"/>
+                <w:sz w:val="30"/>
+                <w:szCs w:val="30"/>
+              </w:rPr>
+              <w:t xml:space="preserve">Lo que más se hace en Sage es buscar información; después, descargar y cruzar.</w:t>
+            </w:r>
+          </w:p>
+          <w:p>
+            <w:pPr>
+              <w:spacing w:after="0"/>
+            </w:pPr>
+            <w:r>
+              <w:rPr>
+                <w:color w:val="4A5466"/>
+              </w:rPr>
+              <w:t xml:space="preserve">Lo hemos visto en todos los departamentos con los que hemos hablado.</w:t>
+            </w:r>
+          </w:p>
+        </w:tc>
+      </w:tr>
+    </w:tbl>
+    <w:p>
+      <w:pPr>
+        <w:spacing w:after="160"/>
+      </w:pPr>
+    </w:p>
+    <w:tbl>
+      <w:tblPr>
+        <w:tblW w:type="dxa" w:w="9638"/>
+        <w:tblBorders>
+          <w:top w:val="single" w:color="auto" w:sz="4"/>
+          <w:left w:val="single" w:color="auto" w:sz="4"/>
+          <w:bottom w:val="single" w:color="auto" w:sz="4"/>
+          <w:right w:val="single" w:color="auto" w:sz="4"/>
+          <w:insideH w:val="single" w:color="auto" w:sz="4"/>
+          <w:insideV w:val="single" w:color="auto" w:sz="4"/>
+        </w:tblBorders>
+        <w:tblLayout w:type="fixed"/>
+      </w:tblPr>
+      <w:tblGrid>
+        <w:gridCol w:w="1946"/>
+        <w:gridCol w:w="2316"/>
+        <w:gridCol w:w="3150"/>
+        <w:gridCol w:w="2226"/>
+      </w:tblGrid>
+      <w:tr>
+        <w:trPr>
+          <w:tblHeader/>
+        </w:trPr>
+        <w:tc>
+          <w:tcPr>
+            <w:tcW w:type="dxa" w:w="1946"/>
+            <w:tcBorders>
+              <w:top w:val="none" w:color="FFFFFF" w:sz="0"/>
+              <w:left w:val="none" w:color="FFFFFF" w:sz="0"/>
+              <w:bottom w:val="single" w:color="004A98" w:sz="10"/>
+              <w:right w:val="none" w:color="FFFFFF" w:sz="0"/>
+            </w:tcBorders>
+            <w:tcMar>
+              <w:top w:type="dxa" w:w="100"/>
+              <w:left w:type="dxa" w:w="120"/>
+              <w:bottom w:type="dxa" w:w="100"/>
+              <w:right w:type="dxa" w:w="120"/>
+            </w:tcMar>
+          </w:tcPr>
+          <w:p>
+            <w:r>
+              <w:rPr>
+                <w:b/>
+                <w:bCs/>
+                <w:color w:val="4A5466"/>
+                <w:sz w:val="15"/>
+                <w:szCs w:val="15"/>
+              </w:rPr>
+              <w:t xml:space="preserve">DEPARTAMENTO</w:t>
+            </w:r>
+          </w:p>
+        </w:tc>
+        <w:tc>
+          <w:tcPr>
+            <w:tcW w:type="dxa" w:w="2316"/>
+            <w:tcBorders>
+              <w:top w:val="none" w:color="FFFFFF" w:sz="0"/>
+              <w:left w:val="none" w:color="FFFFFF" w:sz="0"/>
+              <w:bottom w:val="single" w:color="004A98" w:sz="10"/>
+              <w:right w:val="none" w:color="FFFFFF" w:sz="0"/>
+            </w:tcBorders>
+            <w:tcMar>
+              <w:top w:type="dxa" w:w="100"/>
+              <w:left w:type="dxa" w:w="120"/>
+              <w:bottom w:type="dxa" w:w="100"/>
+              <w:right w:type="dxa" w:w="120"/>
+            </w:tcMar>
+          </w:tcPr>
+          <w:p>
+            <w:r>
+              <w:rPr>
+                <w:b/>
+                <w:bCs/>
+                <w:color w:val="4A5466"/>
+                <w:sz w:val="15"/>
+                <w:szCs w:val="15"/>
+              </w:rPr>
+              <w:t xml:space="preserve">HOY</w:t>
+            </w:r>
+          </w:p>
+        </w:tc>
+        <w:tc>
+          <w:tcPr>
+            <w:tcW w:type="dxa" w:w="3150"/>
+            <w:tcBorders>
+              <w:top w:val="none" w:color="FFFFFF" w:sz="0"/>
+              <w:left w:val="none" w:color="FFFFFF" w:sz="0"/>
+              <w:bottom w:val="single" w:color="004A98" w:sz="10"/>
+              <w:right w:val="none" w:color="FFFFFF" w:sz="0"/>
+            </w:tcBorders>
+            <w:tcMar>
+              <w:top w:type="dxa" w:w="100"/>
+              <w:left w:type="dxa" w:w="120"/>
+              <w:bottom w:type="dxa" w:w="100"/>
+              <w:right w:type="dxa" w:w="120"/>
+            </w:tcMar>
+          </w:tcPr>
+          <w:p>
+            <w:r>
+              <w:rPr>
+                <w:b/>
+                <w:bCs/>
+                <w:color w:val="4A5466"/>
+                <w:sz w:val="15"/>
+                <w:szCs w:val="15"/>
+              </w:rPr>
+              <w:t xml:space="preserve">CON CLAUDE EN CHROME</w:t>
+            </w:r>
+          </w:p>
+        </w:tc>
+        <w:tc>
+          <w:tcPr>
+            <w:tcW w:type="dxa" w:w="2226"/>
+            <w:tcBorders>
+              <w:top w:val="none" w:color="FFFFFF" w:sz="0"/>
+              <w:left w:val="none" w:color="FFFFFF" w:sz="0"/>
+              <w:bottom w:val="single" w:color="004A98" w:sz="10"/>
+              <w:right w:val="none" w:color="FFFFFF" w:sz="0"/>
+            </w:tcBorders>
+            <w:tcMar>
+              <w:top w:type="dxa" w:w="100"/>
+              <w:left w:type="dxa" w:w="120"/>
+              <w:bottom w:type="dxa" w:w="100"/>
+              <w:right w:type="dxa" w:w="120"/>
+            </w:tcMar>
+          </w:tcPr>
+          <w:p>
+            <w:r>
+              <w:rPr>
+                <w:b/>
+                <w:bCs/>
+                <w:color w:val="4A5466"/>
+                <w:sz w:val="15"/>
+                <w:szCs w:val="15"/>
+              </w:rPr>
+              <w:t xml:space="preserve">QUÉ GANAMOS</w:t>
+            </w:r>
+          </w:p>
+        </w:tc>
+      </w:tr>
+      <w:tr>
+        <w:trPr>
+          <w:cantSplit/>
+        </w:trPr>
+        <w:tc>
+          <w:tcPr>
+            <w:tcW w:type="dxa" w:w="1946"/>
+            <w:tcBorders>
+              <w:top w:val="none" w:color="FFFFFF" w:sz="0"/>
+              <w:left w:val="none" w:color="FFFFFF" w:sz="0"/>
+              <w:bottom w:val="single" w:color="DDE0E5" w:sz="4"/>
+              <w:right w:val="none" w:color="FFFFFF" w:sz="0"/>
+            </w:tcBorders>
+            <w:tcMar>
+              <w:top w:type="dxa" w:w="100"/>
+              <w:left w:type="dxa" w:w="120"/>
+              <w:bottom w:type="dxa" w:w="100"/>
+              <w:right w:type="dxa" w:w="120"/>
+            </w:tcMar>
+          </w:tcPr>
+          <w:p>
+            <w:r>
+              <w:rPr>
+                <w:b/>
+                <w:bCs/>
+                <w:sz w:val="20"/>
+                <w:szCs w:val="20"/>
+              </w:rPr>
+              <w:t xml:space="preserve">Compras</w:t>
+            </w:r>
+          </w:p>
+          <w:p>
+            <w:pPr>
+              <w:spacing w:before="80"/>
+            </w:pPr>
+            <w:r>
+              <w:rPr>
+                <w:b/>
+                <w:bCs/>
+                <w:color w:val="CE0E2D"/>
+                <w:sz w:val="17"/>
+                <w:szCs w:val="17"/>
+              </w:rPr>
+              <w:t xml:space="preserve">De momento no:</w:t>
+            </w:r>
+            <w:r>
+              <w:rPr>
+                <w:color w:val="CE0E2D"/>
+                <w:sz w:val="17"/>
+                <w:szCs w:val="17"/>
+              </w:rPr>
+              <w:t xml:space="preserve"> subir tarifas, precios ni referencias.</w:t>
+            </w:r>
+          </w:p>
+        </w:tc>
+        <w:tc>
+          <w:tcPr>
+            <w:tcW w:type="dxa" w:w="2316"/>
+            <w:tcBorders>
+              <w:top w:val="none" w:color="FFFFFF" w:sz="0"/>
+              <w:left w:val="none" w:color="FFFFFF" w:sz="0"/>
+              <w:bottom w:val="single" w:color="DDE0E5" w:sz="4"/>
+              <w:right w:val="none" w:color="FFFFFF" w:sz="0"/>
+            </w:tcBorders>
+            <w:tcMar>
+              <w:top w:type="dxa" w:w="100"/>
+              <w:left w:type="dxa" w:w="120"/>
+              <w:bottom w:type="dxa" w:w="100"/>
+              <w:right w:type="dxa" w:w="120"/>
+            </w:tcMar>
+          </w:tcPr>
+          <w:p>
+            <w:pPr>
+              <w:spacing w:line="270"/>
+            </w:pPr>
+            <w:r>
+              <w:rPr>
+                <w:sz w:val="19"/>
+                <w:szCs w:val="19"/>
+              </w:rPr>
+              <w:t xml:space="preserve">Tarifas, propuestas de pedido y pedidos a proveedor, cruzados a mano.</w:t>
+            </w:r>
+          </w:p>
+        </w:tc>
+        <w:tc>
+          <w:tcPr>
+            <w:tcW w:type="dxa" w:w="3150"/>
+            <w:tcBorders>
+              <w:top w:val="none" w:color="FFFFFF" w:sz="0"/>
+              <w:left w:val="none" w:color="FFFFFF" w:sz="0"/>
+              <w:bottom w:val="single" w:color="DDE0E5" w:sz="4"/>
+              <w:right w:val="none" w:color="FFFFFF" w:sz="0"/>
+            </w:tcBorders>
+            <w:tcMar>
+              <w:top w:type="dxa" w:w="100"/>
+              <w:left w:type="dxa" w:w="120"/>
+              <w:bottom w:type="dxa" w:w="100"/>
+              <w:right w:type="dxa" w:w="120"/>
+            </w:tcMar>
+          </w:tcPr>
+          <w:p>
+            <w:pPr>
+              <w:spacing w:after="40" w:line="260"/>
+            </w:pPr>
+            <w:r>
+              <w:rPr>
+                <w:b/>
+                <w:bCs/>
+                <w:color w:val="004A98"/>
+                <w:sz w:val="18"/>
+                <w:szCs w:val="18"/>
+              </w:rPr>
+              <w:t xml:space="preserve">✓  </w:t>
+            </w:r>
+            <w:r>
+              <w:rPr>
+                <w:sz w:val="18"/>
+                <w:szCs w:val="18"/>
+              </w:rPr>
+              <w:t xml:space="preserve">Consulta la propuesta de pedido, el stock y lo pendiente de recibir</w:t>
+            </w:r>
+          </w:p>
+          <w:p>
+            <w:pPr>
+              <w:spacing w:after="40" w:line="260"/>
+            </w:pPr>
+            <w:r>
+              <w:rPr>
+                <w:b/>
+                <w:bCs/>
+                <w:color w:val="004A98"/>
+                <w:sz w:val="18"/>
+                <w:szCs w:val="18"/>
+              </w:rPr>
+              <w:t xml:space="preserve">✓  </w:t>
+            </w:r>
+            <w:r>
+              <w:rPr>
+                <w:sz w:val="18"/>
+                <w:szCs w:val="18"/>
+              </w:rPr>
+              <w:t xml:space="preserve">Compara la tarifa del proveedor con los precios de Sage</w:t>
+            </w:r>
+          </w:p>
+          <w:p>
+            <w:pPr>
+              <w:spacing w:after="40" w:line="260"/>
+            </w:pPr>
+            <w:r>
+              <w:rPr>
+                <w:b/>
+                <w:bCs/>
+                <w:color w:val="004A98"/>
+                <w:sz w:val="18"/>
+                <w:szCs w:val="18"/>
+              </w:rPr>
+              <w:t xml:space="preserve">✓  </w:t>
+            </w:r>
+            <w:r>
+              <w:rPr>
+                <w:sz w:val="18"/>
+                <w:szCs w:val="18"/>
+              </w:rPr>
+              <w:t xml:space="preserve">Busca equivalencias de referencias en NextShop</w:t>
+            </w:r>
+          </w:p>
+        </w:tc>
+        <w:tc>
+          <w:tcPr>
+            <w:tcW w:type="dxa" w:w="2226"/>
+            <w:tcBorders>
+              <w:top w:val="none" w:color="FFFFFF" w:sz="0"/>
+              <w:left w:val="none" w:color="FFFFFF" w:sz="0"/>
+              <w:bottom w:val="single" w:color="DDE0E5" w:sz="4"/>
+              <w:right w:val="none" w:color="FFFFFF" w:sz="0"/>
+            </w:tcBorders>
+            <w:tcMar>
+              <w:top w:type="dxa" w:w="100"/>
+              <w:left w:type="dxa" w:w="120"/>
+              <w:bottom w:type="dxa" w:w="100"/>
+              <w:right w:type="dxa" w:w="120"/>
+            </w:tcMar>
+          </w:tcPr>
+          <w:p>
+            <w:pPr>
+              <w:spacing w:line="270"/>
+            </w:pPr>
+            <w:r>
+              <w:rPr>
+                <w:b/>
+                <w:bCs/>
+                <w:sz w:val="19"/>
+                <w:szCs w:val="19"/>
+              </w:rPr>
+              <w:t xml:space="preserve">Menos errores de precio y referencia, y adiós a los cruces a mano.</w:t>
+            </w:r>
+          </w:p>
+        </w:tc>
+      </w:tr>
+      <w:tr>
+        <w:trPr>
+          <w:cantSplit/>
+        </w:trPr>
+        <w:tc>
+          <w:tcPr>
+            <w:tcW w:type="dxa" w:w="1946"/>
+            <w:tcBorders>
+              <w:top w:val="none" w:color="FFFFFF" w:sz="0"/>
+              <w:left w:val="none" w:color="FFFFFF" w:sz="0"/>
+              <w:bottom w:val="single" w:color="DDE0E5" w:sz="4"/>
+              <w:right w:val="none" w:color="FFFFFF" w:sz="0"/>
+            </w:tcBorders>
+            <w:tcMar>
+              <w:top w:type="dxa" w:w="100"/>
+              <w:left w:type="dxa" w:w="120"/>
+              <w:bottom w:type="dxa" w:w="100"/>
+              <w:right w:type="dxa" w:w="120"/>
+            </w:tcMar>
+          </w:tcPr>
+          <w:p>
+            <w:r>
+              <w:rPr>
+                <w:b/>
+                <w:bCs/>
+                <w:sz w:val="20"/>
+                <w:szCs w:val="20"/>
+              </w:rPr>
+              <w:t xml:space="preserve">Recepción y almacén</w:t>
+            </w:r>
+          </w:p>
+        </w:tc>
+        <w:tc>
+          <w:tcPr>
+            <w:tcW w:type="dxa" w:w="2316"/>
+            <w:tcBorders>
+              <w:top w:val="none" w:color="FFFFFF" w:sz="0"/>
+              <w:left w:val="none" w:color="FFFFFF" w:sz="0"/>
+              <w:bottom w:val="single" w:color="DDE0E5" w:sz="4"/>
+              <w:right w:val="none" w:color="FFFFFF" w:sz="0"/>
+            </w:tcBorders>
+            <w:tcMar>
+              <w:top w:type="dxa" w:w="100"/>
+              <w:left w:type="dxa" w:w="120"/>
+              <w:bottom w:type="dxa" w:w="100"/>
+              <w:right w:type="dxa" w:w="120"/>
+            </w:tcMar>
+          </w:tcPr>
+          <w:p>
+            <w:pPr>
+              <w:spacing w:line="270"/>
+            </w:pPr>
+            <w:r>
+              <w:rPr>
+                <w:sz w:val="19"/>
+                <w:szCs w:val="19"/>
+              </w:rPr>
+              <w:t xml:space="preserve">Buscar el albarán, descargarlo y contrastarlo a mano con el del proveedor.</w:t>
+            </w:r>
+          </w:p>
+        </w:tc>
+        <w:tc>
+          <w:tcPr>
+            <w:tcW w:type="dxa" w:w="3150"/>
+            <w:tcBorders>
+              <w:top w:val="none" w:color="FFFFFF" w:sz="0"/>
+              <w:left w:val="none" w:color="FFFFFF" w:sz="0"/>
+              <w:bottom w:val="single" w:color="DDE0E5" w:sz="4"/>
+              <w:right w:val="none" w:color="FFFFFF" w:sz="0"/>
+            </w:tcBorders>
+            <w:tcMar>
+              <w:top w:type="dxa" w:w="100"/>
+              <w:left w:type="dxa" w:w="120"/>
+              <w:bottom w:type="dxa" w:w="100"/>
+              <w:right w:type="dxa" w:w="120"/>
+            </w:tcMar>
+          </w:tcPr>
+          <w:p>
+            <w:pPr>
+              <w:spacing w:after="40" w:line="260"/>
+            </w:pPr>
+            <w:r>
+              <w:rPr>
+                <w:b/>
+                <w:bCs/>
+                <w:color w:val="004A98"/>
+                <w:sz w:val="18"/>
+                <w:szCs w:val="18"/>
+              </w:rPr>
+              <w:t xml:space="preserve">✓  </w:t>
+            </w:r>
+            <w:r>
+              <w:rPr>
+                <w:sz w:val="18"/>
+                <w:szCs w:val="18"/>
+              </w:rPr>
+              <w:t xml:space="preserve">Busca y descarga el albarán</w:t>
+            </w:r>
+          </w:p>
+          <w:p>
+            <w:pPr>
+              <w:spacing w:after="40" w:line="260"/>
+            </w:pPr>
+            <w:r>
+              <w:rPr>
+                <w:b/>
+                <w:bCs/>
+                <w:color w:val="004A98"/>
+                <w:sz w:val="18"/>
+                <w:szCs w:val="18"/>
+              </w:rPr>
+              <w:t xml:space="preserve">✓  </w:t>
+            </w:r>
+            <w:r>
+              <w:rPr>
+                <w:sz w:val="18"/>
+                <w:szCs w:val="18"/>
+              </w:rPr>
+              <w:t xml:space="preserve">Lo compara con el del proveedor y da las diferencias</w:t>
+            </w:r>
+          </w:p>
+          <w:p>
+            <w:pPr>
+              <w:spacing w:after="40" w:line="260"/>
+            </w:pPr>
+            <w:r>
+              <w:rPr>
+                <w:b/>
+                <w:bCs/>
+                <w:color w:val="004A98"/>
+                <w:sz w:val="18"/>
+                <w:szCs w:val="18"/>
+              </w:rPr>
+              <w:t xml:space="preserve">✓  </w:t>
+            </w:r>
+            <w:r>
+              <w:rPr>
+                <w:sz w:val="18"/>
+                <w:szCs w:val="18"/>
+              </w:rPr>
+              <w:t xml:space="preserve">Rutina mensual: cruza Sage y Expert SGA para el informe de litigios</w:t>
+            </w:r>
+          </w:p>
+        </w:tc>
+        <w:tc>
+          <w:tcPr>
+            <w:tcW w:type="dxa" w:w="2226"/>
+            <w:tcBorders>
+              <w:top w:val="none" w:color="FFFFFF" w:sz="0"/>
+              <w:left w:val="none" w:color="FFFFFF" w:sz="0"/>
+              <w:bottom w:val="single" w:color="DDE0E5" w:sz="4"/>
+              <w:right w:val="none" w:color="FFFFFF" w:sz="0"/>
+            </w:tcBorders>
+            <w:tcMar>
+              <w:top w:type="dxa" w:w="100"/>
+              <w:left w:type="dxa" w:w="120"/>
+              <w:bottom w:type="dxa" w:w="100"/>
+              <w:right w:type="dxa" w:w="120"/>
+            </w:tcMar>
+          </w:tcPr>
+          <w:p>
+            <w:pPr>
+              <w:spacing w:line="270"/>
+            </w:pPr>
+            <w:r>
+              <w:rPr>
+                <w:b/>
+                <w:bCs/>
+                <w:sz w:val="19"/>
+                <w:szCs w:val="19"/>
+              </w:rPr>
+              <w:t xml:space="preserve">Abres el archivo con las diferencias ya encontradas.</w:t>
+            </w:r>
+          </w:p>
+        </w:tc>
+      </w:tr>
+      <w:tr>
+        <w:trPr>
+          <w:cantSplit/>
+        </w:trPr>
+        <w:tc>
+          <w:tcPr>
+            <w:tcW w:type="dxa" w:w="1946"/>
+            <w:tcBorders>
+              <w:top w:val="none" w:color="FFFFFF" w:sz="0"/>
+              <w:left w:val="none" w:color="FFFFFF" w:sz="0"/>
+              <w:bottom w:val="single" w:color="DDE0E5" w:sz="4"/>
+              <w:right w:val="none" w:color="FFFFFF" w:sz="0"/>
+            </w:tcBorders>
+            <w:tcMar>
+              <w:top w:type="dxa" w:w="100"/>
+              <w:left w:type="dxa" w:w="120"/>
+              <w:bottom w:type="dxa" w:w="100"/>
+              <w:right w:type="dxa" w:w="120"/>
+            </w:tcMar>
+          </w:tcPr>
+          <w:p>
+            <w:r>
+              <w:rPr>
+                <w:b/>
+                <w:bCs/>
+                <w:sz w:val="20"/>
+                <w:szCs w:val="20"/>
+              </w:rPr>
+              <w:t xml:space="preserve">Conformidad de facturas</w:t>
+            </w:r>
+          </w:p>
+          <w:p>
+            <w:pPr>
+              <w:spacing w:before="80"/>
+            </w:pPr>
+            <w:r>
+              <w:rPr>
+                <w:b/>
+                <w:bCs/>
+                <w:color w:val="CE0E2D"/>
+                <w:sz w:val="17"/>
+                <w:szCs w:val="17"/>
+              </w:rPr>
+              <w:t xml:space="preserve">Nunca:</w:t>
+            </w:r>
+            <w:r>
+              <w:rPr>
+                <w:color w:val="CE0E2D"/>
+                <w:sz w:val="17"/>
+                <w:szCs w:val="17"/>
+              </w:rPr>
+              <w:t xml:space="preserve"> registrar ni contabilizar facturas.</w:t>
+            </w:r>
+          </w:p>
+        </w:tc>
+        <w:tc>
+          <w:tcPr>
+            <w:tcW w:type="dxa" w:w="2316"/>
+            <w:tcBorders>
+              <w:top w:val="none" w:color="FFFFFF" w:sz="0"/>
+              <w:left w:val="none" w:color="FFFFFF" w:sz="0"/>
+              <w:bottom w:val="single" w:color="DDE0E5" w:sz="4"/>
+              <w:right w:val="none" w:color="FFFFFF" w:sz="0"/>
+            </w:tcBorders>
+            <w:tcMar>
+              <w:top w:type="dxa" w:w="100"/>
+              <w:left w:type="dxa" w:w="120"/>
+              <w:bottom w:type="dxa" w:w="100"/>
+              <w:right w:type="dxa" w:w="120"/>
+            </w:tcMar>
+          </w:tcPr>
+          <w:p>
+            <w:pPr>
+              <w:spacing w:line="270"/>
+            </w:pPr>
+            <w:r>
+              <w:rPr>
+                <w:sz w:val="19"/>
+                <w:szCs w:val="19"/>
+              </w:rPr>
+              <w:t xml:space="preserve">Revisar cantidades, precios, cargos y abonos de cada factura frente a sus albaranes.</w:t>
+            </w:r>
+          </w:p>
+        </w:tc>
+        <w:tc>
+          <w:tcPr>
+            <w:tcW w:type="dxa" w:w="3150"/>
+            <w:tcBorders>
+              <w:top w:val="none" w:color="FFFFFF" w:sz="0"/>
+              <w:left w:val="none" w:color="FFFFFF" w:sz="0"/>
+              <w:bottom w:val="single" w:color="DDE0E5" w:sz="4"/>
+              <w:right w:val="none" w:color="FFFFFF" w:sz="0"/>
+            </w:tcBorders>
+            <w:tcMar>
+              <w:top w:type="dxa" w:w="100"/>
+              <w:left w:type="dxa" w:w="120"/>
+              <w:bottom w:type="dxa" w:w="100"/>
+              <w:right w:type="dxa" w:w="120"/>
+            </w:tcMar>
+          </w:tcPr>
+          <w:p>
+            <w:pPr>
+              <w:spacing w:after="40" w:line="260"/>
+            </w:pPr>
+            <w:r>
+              <w:rPr>
+                <w:b/>
+                <w:bCs/>
+                <w:color w:val="004A98"/>
+                <w:sz w:val="18"/>
+                <w:szCs w:val="18"/>
+              </w:rPr>
+              <w:t xml:space="preserve">✓  </w:t>
+            </w:r>
+            <w:r>
+              <w:rPr>
+                <w:sz w:val="18"/>
+                <w:szCs w:val="18"/>
+              </w:rPr>
+              <w:t xml:space="preserve">Busca y descarga los albaranes de cada factura</w:t>
+            </w:r>
+          </w:p>
+          <w:p>
+            <w:pPr>
+              <w:spacing w:after="40" w:line="260"/>
+            </w:pPr>
+            <w:r>
+              <w:rPr>
+                <w:b/>
+                <w:bCs/>
+                <w:color w:val="004A98"/>
+                <w:sz w:val="18"/>
+                <w:szCs w:val="18"/>
+              </w:rPr>
+              <w:t xml:space="preserve">✓  </w:t>
+            </w:r>
+            <w:r>
+              <w:rPr>
+                <w:sz w:val="18"/>
+                <w:szCs w:val="18"/>
+              </w:rPr>
+              <w:t xml:space="preserve">Prepara el contraste factura-albaranes con solo las diferencias</w:t>
+            </w:r>
+          </w:p>
+        </w:tc>
+        <w:tc>
+          <w:tcPr>
+            <w:tcW w:type="dxa" w:w="2226"/>
+            <w:tcBorders>
+              <w:top w:val="none" w:color="FFFFFF" w:sz="0"/>
+              <w:left w:val="none" w:color="FFFFFF" w:sz="0"/>
+              <w:bottom w:val="single" w:color="DDE0E5" w:sz="4"/>
+              <w:right w:val="none" w:color="FFFFFF" w:sz="0"/>
+            </w:tcBorders>
+            <w:tcMar>
+              <w:top w:type="dxa" w:w="100"/>
+              <w:left w:type="dxa" w:w="120"/>
+              <w:bottom w:type="dxa" w:w="100"/>
+              <w:right w:type="dxa" w:w="120"/>
+            </w:tcMar>
+          </w:tcPr>
+          <w:p>
+            <w:pPr>
+              <w:spacing w:line="270"/>
+            </w:pPr>
+            <w:r>
+              <w:rPr>
+                <w:b/>
+                <w:bCs/>
+                <w:sz w:val="19"/>
+                <w:szCs w:val="19"/>
+              </w:rPr>
+              <w:t xml:space="preserve">La revisión empieza por las diferencias, no por cero.</w:t>
+            </w:r>
+          </w:p>
+        </w:tc>
+      </w:tr>
+      <w:tr>
+        <w:trPr>
+          <w:cantSplit/>
+        </w:trPr>
+        <w:tc>
+          <w:tcPr>
+            <w:tcW w:type="dxa" w:w="1946"/>
+            <w:tcBorders>
+              <w:top w:val="none" w:color="FFFFFF" w:sz="0"/>
+              <w:left w:val="none" w:color="FFFFFF" w:sz="0"/>
+              <w:bottom w:val="single" w:color="DDE0E5" w:sz="4"/>
+              <w:right w:val="none" w:color="FFFFFF" w:sz="0"/>
+            </w:tcBorders>
+            <w:tcMar>
+              <w:top w:type="dxa" w:w="100"/>
+              <w:left w:type="dxa" w:w="120"/>
+              <w:bottom w:type="dxa" w:w="100"/>
+              <w:right w:type="dxa" w:w="120"/>
+            </w:tcMar>
+          </w:tcPr>
+          <w:p>
+            <w:r>
+              <w:rPr>
+                <w:b/>
+                <w:bCs/>
+                <w:sz w:val="20"/>
+                <w:szCs w:val="20"/>
+              </w:rPr>
+              <w:t xml:space="preserve">Contabilidad y tesorería</w:t>
+            </w:r>
+          </w:p>
+          <w:p>
+            <w:pPr>
+              <w:spacing w:before="80"/>
+            </w:pPr>
+            <w:r>
+              <w:rPr>
+                <w:b/>
+                <w:bCs/>
+                <w:color w:val="CE0E2D"/>
+                <w:sz w:val="17"/>
+                <w:szCs w:val="17"/>
+              </w:rPr>
+              <w:t xml:space="preserve">Nunca:</w:t>
+            </w:r>
+            <w:r>
+              <w:rPr>
+                <w:color w:val="CE0E2D"/>
+                <w:sz w:val="17"/>
+                <w:szCs w:val="17"/>
+              </w:rPr>
+              <w:t xml:space="preserve"> contabilizar, pagar ni dar el OK a un pago.</w:t>
+            </w:r>
+          </w:p>
+        </w:tc>
+        <w:tc>
+          <w:tcPr>
+            <w:tcW w:type="dxa" w:w="2316"/>
+            <w:tcBorders>
+              <w:top w:val="none" w:color="FFFFFF" w:sz="0"/>
+              <w:left w:val="none" w:color="FFFFFF" w:sz="0"/>
+              <w:bottom w:val="single" w:color="DDE0E5" w:sz="4"/>
+              <w:right w:val="none" w:color="FFFFFF" w:sz="0"/>
+            </w:tcBorders>
+            <w:tcMar>
+              <w:top w:type="dxa" w:w="100"/>
+              <w:left w:type="dxa" w:w="120"/>
+              <w:bottom w:type="dxa" w:w="100"/>
+              <w:right w:type="dxa" w:w="120"/>
+            </w:tcMar>
+          </w:tcPr>
+          <w:p>
+            <w:pPr>
+              <w:spacing w:line="270"/>
+            </w:pPr>
+            <w:r>
+              <w:rPr>
+                <w:sz w:val="19"/>
+                <w:szCs w:val="19"/>
+              </w:rPr>
+              <w:t xml:space="preserve">Lo que más se hace es buscar información y sacar informes.</w:t>
+            </w:r>
+          </w:p>
+        </w:tc>
+        <w:tc>
+          <w:tcPr>
+            <w:tcW w:type="dxa" w:w="3150"/>
+            <w:tcBorders>
+              <w:top w:val="none" w:color="FFFFFF" w:sz="0"/>
+              <w:left w:val="none" w:color="FFFFFF" w:sz="0"/>
+              <w:bottom w:val="single" w:color="DDE0E5" w:sz="4"/>
+              <w:right w:val="none" w:color="FFFFFF" w:sz="0"/>
+            </w:tcBorders>
+            <w:tcMar>
+              <w:top w:type="dxa" w:w="100"/>
+              <w:left w:type="dxa" w:w="120"/>
+              <w:bottom w:type="dxa" w:w="100"/>
+              <w:right w:type="dxa" w:w="120"/>
+            </w:tcMar>
+          </w:tcPr>
+          <w:p>
+            <w:pPr>
+              <w:spacing w:after="40" w:line="260"/>
+            </w:pPr>
+            <w:r>
+              <w:rPr>
+                <w:b/>
+                <w:bCs/>
+                <w:color w:val="004A98"/>
+                <w:sz w:val="18"/>
+                <w:szCs w:val="18"/>
+              </w:rPr>
+              <w:t xml:space="preserve">✓  </w:t>
+            </w:r>
+            <w:r>
+              <w:rPr>
+                <w:sz w:val="18"/>
+                <w:szCs w:val="18"/>
+              </w:rPr>
+              <w:t xml:space="preserve">Busca la situación de un cliente o asientos por importe</w:t>
+            </w:r>
+          </w:p>
+          <w:p>
+            <w:pPr>
+              <w:spacing w:after="40" w:line="260"/>
+            </w:pPr>
+            <w:r>
+              <w:rPr>
+                <w:b/>
+                <w:bCs/>
+                <w:color w:val="004A98"/>
+                <w:sz w:val="18"/>
+                <w:szCs w:val="18"/>
+              </w:rPr>
+              <w:t xml:space="preserve">✓  </w:t>
+            </w:r>
+            <w:r>
+              <w:rPr>
+                <w:sz w:val="18"/>
+                <w:szCs w:val="18"/>
+              </w:rPr>
+              <w:t xml:space="preserve">Descarga informes, como clientes con encurso superado</w:t>
+            </w:r>
+          </w:p>
+          <w:p>
+            <w:pPr>
+              <w:spacing w:after="40" w:line="260"/>
+            </w:pPr>
+            <w:r>
+              <w:rPr>
+                <w:b/>
+                <w:bCs/>
+                <w:color w:val="004A98"/>
+                <w:sz w:val="18"/>
+                <w:szCs w:val="18"/>
+              </w:rPr>
+              <w:t xml:space="preserve">✓  </w:t>
+            </w:r>
+            <w:r>
+              <w:rPr>
+                <w:sz w:val="18"/>
+                <w:szCs w:val="18"/>
+              </w:rPr>
+              <w:t xml:space="preserve">Prepara los vencimientos por método de pago</w:t>
+            </w:r>
+          </w:p>
+        </w:tc>
+        <w:tc>
+          <w:tcPr>
+            <w:tcW w:type="dxa" w:w="2226"/>
+            <w:tcBorders>
+              <w:top w:val="none" w:color="FFFFFF" w:sz="0"/>
+              <w:left w:val="none" w:color="FFFFFF" w:sz="0"/>
+              <w:bottom w:val="single" w:color="DDE0E5" w:sz="4"/>
+              <w:right w:val="none" w:color="FFFFFF" w:sz="0"/>
+            </w:tcBorders>
+            <w:tcMar>
+              <w:top w:type="dxa" w:w="100"/>
+              <w:left w:type="dxa" w:w="120"/>
+              <w:bottom w:type="dxa" w:w="100"/>
+              <w:right w:type="dxa" w:w="120"/>
+            </w:tcMar>
+          </w:tcPr>
+          <w:p>
+            <w:pPr>
+              <w:spacing w:line="270"/>
+            </w:pPr>
+            <w:r>
+              <w:rPr>
+                <w:b/>
+                <w:bCs/>
+                <w:sz w:val="19"/>
+                <w:szCs w:val="19"/>
+              </w:rPr>
+              <w:t xml:space="preserve">Horas de búsqueda que pasan a ser una pregunta.</w:t>
+            </w:r>
+          </w:p>
+        </w:tc>
+      </w:tr>
+      <w:tr>
+        <w:trPr>
+          <w:cantSplit/>
+        </w:trPr>
+        <w:tc>
+          <w:tcPr>
+            <w:tcW w:type="dxa" w:w="1946"/>
+            <w:tcBorders>
+              <w:top w:val="none" w:color="FFFFFF" w:sz="0"/>
+              <w:left w:val="none" w:color="FFFFFF" w:sz="0"/>
+              <w:bottom w:val="single" w:color="DDE0E5" w:sz="4"/>
+              <w:right w:val="none" w:color="FFFFFF" w:sz="0"/>
+            </w:tcBorders>
+            <w:tcMar>
+              <w:top w:type="dxa" w:w="100"/>
+              <w:left w:type="dxa" w:w="120"/>
+              <w:bottom w:type="dxa" w:w="100"/>
+              <w:right w:type="dxa" w:w="120"/>
+            </w:tcMar>
+          </w:tcPr>
+          <w:p>
+            <w:r>
+              <w:rPr>
+                <w:b/>
+                <w:bCs/>
+                <w:sz w:val="20"/>
+                <w:szCs w:val="20"/>
+              </w:rPr>
+              <w:t xml:space="preserve">Cobros y riesgo</w:t>
+            </w:r>
+          </w:p>
+        </w:tc>
+        <w:tc>
+          <w:tcPr>
+            <w:tcW w:type="dxa" w:w="2316"/>
+            <w:tcBorders>
+              <w:top w:val="none" w:color="FFFFFF" w:sz="0"/>
+              <w:left w:val="none" w:color="FFFFFF" w:sz="0"/>
+              <w:bottom w:val="single" w:color="DDE0E5" w:sz="4"/>
+              <w:right w:val="none" w:color="FFFFFF" w:sz="0"/>
+            </w:tcBorders>
+            <w:tcMar>
+              <w:top w:type="dxa" w:w="100"/>
+              <w:left w:type="dxa" w:w="120"/>
+              <w:bottom w:type="dxa" w:w="100"/>
+              <w:right w:type="dxa" w:w="120"/>
+            </w:tcMar>
+          </w:tcPr>
+          <w:p>
+            <w:pPr>
+              <w:spacing w:line="270"/>
+            </w:pPr>
+            <w:r>
+              <w:rPr>
+                <w:sz w:val="19"/>
+                <w:szCs w:val="19"/>
+              </w:rPr>
+              <w:t xml:space="preserve">Todo el día mirando qué debe cada cliente: vencidos e impagos.</w:t>
+            </w:r>
+          </w:p>
+        </w:tc>
+        <w:tc>
+          <w:tcPr>
+            <w:tcW w:type="dxa" w:w="3150"/>
+            <w:tcBorders>
+              <w:top w:val="none" w:color="FFFFFF" w:sz="0"/>
+              <w:left w:val="none" w:color="FFFFFF" w:sz="0"/>
+              <w:bottom w:val="single" w:color="DDE0E5" w:sz="4"/>
+              <w:right w:val="none" w:color="FFFFFF" w:sz="0"/>
+            </w:tcBorders>
+            <w:tcMar>
+              <w:top w:type="dxa" w:w="100"/>
+              <w:left w:type="dxa" w:w="120"/>
+              <w:bottom w:type="dxa" w:w="100"/>
+              <w:right w:type="dxa" w:w="120"/>
+            </w:tcMar>
+          </w:tcPr>
+          <w:p>
+            <w:pPr>
+              <w:spacing w:after="40" w:line="260"/>
+            </w:pPr>
+            <w:r>
+              <w:rPr>
+                <w:b/>
+                <w:bCs/>
+                <w:color w:val="004A98"/>
+                <w:sz w:val="18"/>
+                <w:szCs w:val="18"/>
+              </w:rPr>
+              <w:t xml:space="preserve">✓  </w:t>
+            </w:r>
+            <w:r>
+              <w:rPr>
+                <w:sz w:val="18"/>
+                <w:szCs w:val="18"/>
+              </w:rPr>
+              <w:t xml:space="preserve">«Resúmeme la situación del cliente X»: deuda, vencidos e impagos</w:t>
+            </w:r>
+          </w:p>
+          <w:p>
+            <w:pPr>
+              <w:spacing w:after="40" w:line="260"/>
+            </w:pPr>
+            <w:r>
+              <w:rPr>
+                <w:b/>
+                <w:bCs/>
+                <w:color w:val="004A98"/>
+                <w:sz w:val="18"/>
+                <w:szCs w:val="18"/>
+              </w:rPr>
+              <w:t xml:space="preserve">✓  </w:t>
+            </w:r>
+            <w:r>
+              <w:rPr>
+                <w:sz w:val="18"/>
+                <w:szCs w:val="18"/>
+              </w:rPr>
+              <w:t xml:space="preserve">En segundos, antes de llamar</w:t>
+            </w:r>
+          </w:p>
+        </w:tc>
+        <w:tc>
+          <w:tcPr>
+            <w:tcW w:type="dxa" w:w="2226"/>
+            <w:tcBorders>
+              <w:top w:val="none" w:color="FFFFFF" w:sz="0"/>
+              <w:left w:val="none" w:color="FFFFFF" w:sz="0"/>
+              <w:bottom w:val="single" w:color="DDE0E5" w:sz="4"/>
+              <w:right w:val="none" w:color="FFFFFF" w:sz="0"/>
+            </w:tcBorders>
+            <w:tcMar>
+              <w:top w:type="dxa" w:w="100"/>
+              <w:left w:type="dxa" w:w="120"/>
+              <w:bottom w:type="dxa" w:w="100"/>
+              <w:right w:type="dxa" w:w="120"/>
+            </w:tcMar>
+          </w:tcPr>
+          <w:p>
+            <w:pPr>
+              <w:spacing w:line="270"/>
+            </w:pPr>
+            <w:r>
+              <w:rPr>
+                <w:b/>
+                <w:bCs/>
+                <w:sz w:val="19"/>
+                <w:szCs w:val="19"/>
+              </w:rPr>
+              <w:t xml:space="preserve">Cada llamada, con el resumen ya hecho.</w:t>
+            </w:r>
+          </w:p>
+        </w:tc>
+      </w:tr>
+      <w:tr>
+        <w:trPr>
+          <w:cantSplit/>
+        </w:trPr>
+        <w:tc>
+          <w:tcPr>
+            <w:tcW w:type="dxa" w:w="1946"/>
+            <w:tcBorders>
+              <w:top w:val="none" w:color="FFFFFF" w:sz="0"/>
+              <w:left w:val="none" w:color="FFFFFF" w:sz="0"/>
+              <w:bottom w:val="single" w:color="DDE0E5" w:sz="4"/>
+              <w:right w:val="none" w:color="FFFFFF" w:sz="0"/>
+            </w:tcBorders>
+            <w:tcMar>
+              <w:top w:type="dxa" w:w="100"/>
+              <w:left w:type="dxa" w:w="120"/>
+              <w:bottom w:type="dxa" w:w="100"/>
+              <w:right w:type="dxa" w:w="120"/>
+            </w:tcMar>
+          </w:tcPr>
+          <w:p>
+            <w:r>
+              <w:rPr>
+                <w:b/>
+                <w:bCs/>
+                <w:sz w:val="20"/>
+                <w:szCs w:val="20"/>
+              </w:rPr>
+              <w:t xml:space="preserve">Comercial y call center</w:t>
+            </w:r>
+          </w:p>
+        </w:tc>
+        <w:tc>
+          <w:tcPr>
+            <w:tcW w:type="dxa" w:w="2316"/>
+            <w:tcBorders>
+              <w:top w:val="none" w:color="FFFFFF" w:sz="0"/>
+              <w:left w:val="none" w:color="FFFFFF" w:sz="0"/>
+              <w:bottom w:val="single" w:color="DDE0E5" w:sz="4"/>
+              <w:right w:val="none" w:color="FFFFFF" w:sz="0"/>
+            </w:tcBorders>
+            <w:tcMar>
+              <w:top w:type="dxa" w:w="100"/>
+              <w:left w:type="dxa" w:w="120"/>
+              <w:bottom w:type="dxa" w:w="100"/>
+              <w:right w:type="dxa" w:w="120"/>
+            </w:tcMar>
+          </w:tcPr>
+          <w:p>
+            <w:pPr>
+              <w:spacing w:line="270"/>
+            </w:pPr>
+            <w:r>
+              <w:rPr>
+                <w:sz w:val="19"/>
+                <w:szCs w:val="19"/>
+              </w:rPr>
+              <w:t xml:space="preserve">Consultar stock, pedidos y tarifas, y sacar los informes de Ventas.</w:t>
+            </w:r>
+          </w:p>
+        </w:tc>
+        <w:tc>
+          <w:tcPr>
+            <w:tcW w:type="dxa" w:w="3150"/>
+            <w:tcBorders>
+              <w:top w:val="none" w:color="FFFFFF" w:sz="0"/>
+              <w:left w:val="none" w:color="FFFFFF" w:sz="0"/>
+              <w:bottom w:val="single" w:color="DDE0E5" w:sz="4"/>
+              <w:right w:val="none" w:color="FFFFFF" w:sz="0"/>
+            </w:tcBorders>
+            <w:tcMar>
+              <w:top w:type="dxa" w:w="100"/>
+              <w:left w:type="dxa" w:w="120"/>
+              <w:bottom w:type="dxa" w:w="100"/>
+              <w:right w:type="dxa" w:w="120"/>
+            </w:tcMar>
+          </w:tcPr>
+          <w:p>
+            <w:pPr>
+              <w:spacing w:after="40" w:line="260"/>
+            </w:pPr>
+            <w:r>
+              <w:rPr>
+                <w:b/>
+                <w:bCs/>
+                <w:color w:val="004A98"/>
+                <w:sz w:val="18"/>
+                <w:szCs w:val="18"/>
+              </w:rPr>
+              <w:t xml:space="preserve">✓  </w:t>
+            </w:r>
+            <w:r>
+              <w:rPr>
+                <w:sz w:val="18"/>
+                <w:szCs w:val="18"/>
+              </w:rPr>
+              <w:t xml:space="preserve">«¿Hay stock?», «¿se ha entregado?», «¿qué tarifa tiene?»</w:t>
+            </w:r>
+          </w:p>
+          <w:p>
+            <w:pPr>
+              <w:spacing w:after="40" w:line="260"/>
+            </w:pPr>
+            <w:r>
+              <w:rPr>
+                <w:b/>
+                <w:bCs/>
+                <w:color w:val="004A98"/>
+                <w:sz w:val="18"/>
+                <w:szCs w:val="18"/>
+              </w:rPr>
+              <w:t xml:space="preserve">✓  </w:t>
+            </w:r>
+            <w:r>
+              <w:rPr>
+                <w:sz w:val="18"/>
+                <w:szCs w:val="18"/>
+              </w:rPr>
+              <w:t xml:space="preserve">Descarga el informe comercial del mes, resumido</w:t>
+            </w:r>
+          </w:p>
+        </w:tc>
+        <w:tc>
+          <w:tcPr>
+            <w:tcW w:type="dxa" w:w="2226"/>
+            <w:tcBorders>
+              <w:top w:val="none" w:color="FFFFFF" w:sz="0"/>
+              <w:left w:val="none" w:color="FFFFFF" w:sz="0"/>
+              <w:bottom w:val="single" w:color="DDE0E5" w:sz="4"/>
+              <w:right w:val="none" w:color="FFFFFF" w:sz="0"/>
+            </w:tcBorders>
+            <w:tcMar>
+              <w:top w:type="dxa" w:w="100"/>
+              <w:left w:type="dxa" w:w="120"/>
+              <w:bottom w:type="dxa" w:w="100"/>
+              <w:right w:type="dxa" w:w="120"/>
+            </w:tcMar>
+          </w:tcPr>
+          <w:p>
+            <w:pPr>
+              <w:spacing w:line="270"/>
+            </w:pPr>
+            <w:r>
+              <w:rPr>
+                <w:b/>
+                <w:bCs/>
+                <w:sz w:val="19"/>
+                <w:szCs w:val="19"/>
+              </w:rPr>
+              <w:t xml:space="preserve">Respuestas al cliente más rápidas.</w:t>
+            </w:r>
+          </w:p>
+        </w:tc>
+      </w:tr>
+    </w:tbl>
+    <w:p>
+      <w:pPr>
+        <w:spacing w:after="160"/>
+      </w:pPr>
+    </w:p>
+    <w:p>
+      <w:pPr>
+        <w:pStyle w:val="Heading2"/>
+      </w:pPr>
+      <w:r>
+        <w:t xml:space="preserve">Niveles de acceso</w:t>
+      </w:r>
+    </w:p>
+    <w:tbl>
+      <w:tblPr>
+        <w:tblW w:type="dxa" w:w="9638"/>
+        <w:tblBorders>
+          <w:top w:val="single" w:color="auto" w:sz="4"/>
+          <w:left w:val="single" w:color="auto" w:sz="4"/>
+          <w:bottom w:val="single" w:color="auto" w:sz="4"/>
+          <w:right w:val="single" w:color="auto" w:sz="4"/>
+          <w:insideH w:val="single" w:color="auto" w:sz="4"/>
+          <w:insideV w:val="single" w:color="auto" w:sz="4"/>
+        </w:tblBorders>
+        <w:tblLayout w:type="fixed"/>
+      </w:tblPr>
+      <w:tblGrid>
+        <w:gridCol w:w="2038"/>
+        <w:gridCol w:w="2965"/>
+        <w:gridCol w:w="2409"/>
+        <w:gridCol w:w="2226"/>
+      </w:tblGrid>
+      <w:tr>
+        <w:trPr>
+          <w:tblHeader/>
+        </w:trPr>
+        <w:tc>
+          <w:tcPr>
+            <w:tcW w:type="dxa" w:w="2038"/>
+            <w:tcBorders>
+              <w:top w:val="none" w:color="FFFFFF" w:sz="0"/>
+              <w:left w:val="none" w:color="FFFFFF" w:sz="0"/>
+              <w:bottom w:val="single" w:color="004A98" w:sz="10"/>
+              <w:right w:val="none" w:color="FFFFFF" w:sz="0"/>
+            </w:tcBorders>
+            <w:tcMar>
+              <w:top w:type="dxa" w:w="100"/>
+              <w:left w:type="dxa" w:w="120"/>
+              <w:bottom w:type="dxa" w:w="100"/>
+              <w:right w:type="dxa" w:w="120"/>
+            </w:tcMar>
+          </w:tcPr>
+          <w:p>
+            <w:r>
+              <w:rPr>
+                <w:b/>
+                <w:bCs/>
+                <w:color w:val="4A5466"/>
+                <w:sz w:val="15"/>
+                <w:szCs w:val="15"/>
+              </w:rPr>
+              <w:t xml:space="preserve">NIVEL</w:t>
+            </w:r>
+          </w:p>
+        </w:tc>
+        <w:tc>
+          <w:tcPr>
+            <w:tcW w:type="dxa" w:w="2965"/>
+            <w:tcBorders>
+              <w:top w:val="none" w:color="FFFFFF" w:sz="0"/>
+              <w:left w:val="none" w:color="FFFFFF" w:sz="0"/>
+              <w:bottom w:val="single" w:color="004A98" w:sz="10"/>
+              <w:right w:val="none" w:color="FFFFFF" w:sz="0"/>
+            </w:tcBorders>
+            <w:tcMar>
+              <w:top w:type="dxa" w:w="100"/>
+              <w:left w:type="dxa" w:w="120"/>
+              <w:bottom w:type="dxa" w:w="100"/>
+              <w:right w:type="dxa" w:w="120"/>
+            </w:tcMar>
+          </w:tcPr>
+          <w:p>
+            <w:r>
+              <w:rPr>
+                <w:b/>
+                <w:bCs/>
+                <w:color w:val="4A5466"/>
+                <w:sz w:val="15"/>
+                <w:szCs w:val="15"/>
+              </w:rPr>
+              <w:t xml:space="preserve">QUÉ PUEDE HACER CLAUDE</w:t>
+            </w:r>
+          </w:p>
+        </w:tc>
+        <w:tc>
+          <w:tcPr>
+            <w:tcW w:type="dxa" w:w="2409"/>
+            <w:tcBorders>
+              <w:top w:val="none" w:color="FFFFFF" w:sz="0"/>
+              <w:left w:val="none" w:color="FFFFFF" w:sz="0"/>
+              <w:bottom w:val="single" w:color="004A98" w:sz="10"/>
+              <w:right w:val="none" w:color="FFFFFF" w:sz="0"/>
+            </w:tcBorders>
+            <w:tcMar>
+              <w:top w:type="dxa" w:w="100"/>
+              <w:left w:type="dxa" w:w="120"/>
+              <w:bottom w:type="dxa" w:w="100"/>
+              <w:right w:type="dxa" w:w="120"/>
+            </w:tcMar>
+          </w:tcPr>
+          <w:p>
+            <w:r>
+              <w:rPr>
+                <w:b/>
+                <w:bCs/>
+                <w:color w:val="4A5466"/>
+                <w:sz w:val="15"/>
+                <w:szCs w:val="15"/>
+              </w:rPr>
+              <w:t xml:space="preserve">EJEMPLO</w:t>
+            </w:r>
+          </w:p>
+        </w:tc>
+        <w:tc>
+          <w:tcPr>
+            <w:tcW w:type="dxa" w:w="2226"/>
+            <w:tcBorders>
+              <w:top w:val="none" w:color="FFFFFF" w:sz="0"/>
+              <w:left w:val="none" w:color="FFFFFF" w:sz="0"/>
+              <w:bottom w:val="single" w:color="004A98" w:sz="10"/>
+              <w:right w:val="none" w:color="FFFFFF" w:sz="0"/>
+            </w:tcBorders>
+            <w:tcMar>
+              <w:top w:type="dxa" w:w="100"/>
+              <w:left w:type="dxa" w:w="120"/>
+              <w:bottom w:type="dxa" w:w="100"/>
+              <w:right w:type="dxa" w:w="120"/>
+            </w:tcMar>
+          </w:tcPr>
+          <w:p>
+            <w:r>
+              <w:rPr>
+                <w:b/>
+                <w:bCs/>
+                <w:color w:val="4A5466"/>
+                <w:sz w:val="15"/>
+                <w:szCs w:val="15"/>
+              </w:rPr>
+              <w:t xml:space="preserve">CUÁNDO</w:t>
+            </w:r>
+          </w:p>
+        </w:tc>
+      </w:tr>
+      <w:tr>
+        <w:trPr>
+          <w:cantSplit/>
+        </w:trPr>
+        <w:tc>
+          <w:tcPr>
+            <w:tcW w:type="dxa" w:w="2038"/>
+            <w:tcBorders>
+              <w:top w:val="none" w:color="FFFFFF" w:sz="0"/>
+              <w:left w:val="none" w:color="FFFFFF" w:sz="0"/>
+              <w:bottom w:val="single" w:color="DDE0E5" w:sz="4"/>
+              <w:right w:val="none" w:color="FFFFFF" w:sz="0"/>
+            </w:tcBorders>
+            <w:tcMar>
+              <w:top w:type="dxa" w:w="100"/>
+              <w:left w:type="dxa" w:w="120"/>
+              <w:bottom w:type="dxa" w:w="100"/>
+              <w:right w:type="dxa" w:w="120"/>
+            </w:tcMar>
+          </w:tcPr>
+          <w:p>
+            <w:pPr>
+              <w:spacing w:line="270"/>
+            </w:pPr>
+            <w:r>
+              <w:rPr>
+                <w:b/>
+                <w:bCs/>
+                <w:sz w:val="19"/>
+                <w:szCs w:val="19"/>
+              </w:rPr>
+              <w:t xml:space="preserve">1 · Consultar</w:t>
+            </w:r>
+          </w:p>
+        </w:tc>
+        <w:tc>
+          <w:tcPr>
+            <w:tcW w:type="dxa" w:w="2965"/>
+            <w:tcBorders>
+              <w:top w:val="none" w:color="FFFFFF" w:sz="0"/>
+              <w:left w:val="none" w:color="FFFFFF" w:sz="0"/>
+              <w:bottom w:val="single" w:color="DDE0E5" w:sz="4"/>
+              <w:right w:val="none" w:color="FFFFFF" w:sz="0"/>
+            </w:tcBorders>
+            <w:tcMar>
+              <w:top w:type="dxa" w:w="100"/>
+              <w:left w:type="dxa" w:w="120"/>
+              <w:bottom w:type="dxa" w:w="100"/>
+              <w:right w:type="dxa" w:w="120"/>
+            </w:tcMar>
+          </w:tcPr>
+          <w:p>
+            <w:pPr>
+              <w:spacing w:line="270"/>
+            </w:pPr>
+            <w:r>
+              <w:rPr>
+                <w:sz w:val="19"/>
+                <w:szCs w:val="19"/>
+              </w:rPr>
+              <w:t xml:space="preserve">Buscar y leer en Sage y en otras webs de la empresa.</w:t>
+            </w:r>
+          </w:p>
+        </w:tc>
+        <w:tc>
+          <w:tcPr>
+            <w:tcW w:type="dxa" w:w="2409"/>
+            <w:tcBorders>
+              <w:top w:val="none" w:color="FFFFFF" w:sz="0"/>
+              <w:left w:val="none" w:color="FFFFFF" w:sz="0"/>
+              <w:bottom w:val="single" w:color="DDE0E5" w:sz="4"/>
+              <w:right w:val="none" w:color="FFFFFF" w:sz="0"/>
+            </w:tcBorders>
+            <w:tcMar>
+              <w:top w:type="dxa" w:w="100"/>
+              <w:left w:type="dxa" w:w="120"/>
+              <w:bottom w:type="dxa" w:w="100"/>
+              <w:right w:type="dxa" w:w="120"/>
+            </w:tcMar>
+          </w:tcPr>
+          <w:p>
+            <w:pPr>
+              <w:spacing w:line="270"/>
+            </w:pPr>
+            <w:r>
+              <w:rPr>
+                <w:sz w:val="19"/>
+                <w:szCs w:val="19"/>
+              </w:rPr>
+              <w:t xml:space="preserve">«¿Hay stock de esta referencia?»</w:t>
+            </w:r>
+          </w:p>
+        </w:tc>
+        <w:tc>
+          <w:tcPr>
+            <w:tcW w:type="dxa" w:w="2226"/>
+            <w:tcBorders>
+              <w:top w:val="none" w:color="FFFFFF" w:sz="0"/>
+              <w:left w:val="none" w:color="FFFFFF" w:sz="0"/>
+              <w:bottom w:val="single" w:color="DDE0E5" w:sz="4"/>
+              <w:right w:val="none" w:color="FFFFFF" w:sz="0"/>
+            </w:tcBorders>
+            <w:tcMar>
+              <w:top w:type="dxa" w:w="100"/>
+              <w:left w:type="dxa" w:w="120"/>
+              <w:bottom w:type="dxa" w:w="100"/>
+              <w:right w:type="dxa" w:w="120"/>
+            </w:tcMar>
+          </w:tcPr>
+          <w:p>
+            <w:pPr>
+              <w:spacing w:line="270"/>
+            </w:pPr>
+            <w:r>
+              <w:rPr>
+                <w:b/>
+                <w:bCs/>
+                <w:sz w:val="19"/>
+                <w:szCs w:val="19"/>
+              </w:rPr>
+              <w:t xml:space="preserve">Desde el primer día</w:t>
+            </w:r>
+          </w:p>
+        </w:tc>
+      </w:tr>
+      <w:tr>
+        <w:trPr>
+          <w:cantSplit/>
+        </w:trPr>
+        <w:tc>
+          <w:tcPr>
+            <w:tcW w:type="dxa" w:w="2038"/>
+            <w:tcBorders>
+              <w:top w:val="none" w:color="FFFFFF" w:sz="0"/>
+              <w:left w:val="none" w:color="FFFFFF" w:sz="0"/>
+              <w:bottom w:val="single" w:color="DDE0E5" w:sz="4"/>
+              <w:right w:val="none" w:color="FFFFFF" w:sz="0"/>
+            </w:tcBorders>
+            <w:tcMar>
+              <w:top w:type="dxa" w:w="100"/>
+              <w:left w:type="dxa" w:w="120"/>
+              <w:bottom w:type="dxa" w:w="100"/>
+              <w:right w:type="dxa" w:w="120"/>
+            </w:tcMar>
+          </w:tcPr>
+          <w:p>
+            <w:pPr>
+              <w:spacing w:line="270"/>
+            </w:pPr>
+            <w:r>
+              <w:rPr>
+                <w:b/>
+                <w:bCs/>
+                <w:sz w:val="19"/>
+                <w:szCs w:val="19"/>
+              </w:rPr>
+              <w:t xml:space="preserve">2 · Descargar y comparar</w:t>
+            </w:r>
+          </w:p>
+        </w:tc>
+        <w:tc>
+          <w:tcPr>
+            <w:tcW w:type="dxa" w:w="2965"/>
+            <w:tcBorders>
+              <w:top w:val="none" w:color="FFFFFF" w:sz="0"/>
+              <w:left w:val="none" w:color="FFFFFF" w:sz="0"/>
+              <w:bottom w:val="single" w:color="DDE0E5" w:sz="4"/>
+              <w:right w:val="none" w:color="FFFFFF" w:sz="0"/>
+            </w:tcBorders>
+            <w:tcMar>
+              <w:top w:type="dxa" w:w="100"/>
+              <w:left w:type="dxa" w:w="120"/>
+              <w:bottom w:type="dxa" w:w="100"/>
+              <w:right w:type="dxa" w:w="120"/>
+            </w:tcMar>
+          </w:tcPr>
+          <w:p>
+            <w:pPr>
+              <w:spacing w:line="270"/>
+            </w:pPr>
+            <w:r>
+              <w:rPr>
+                <w:sz w:val="19"/>
+                <w:szCs w:val="19"/>
+              </w:rPr>
+              <w:t xml:space="preserve">A una carpeta de trabajo, contra el documento del proveedor o un Excel.</w:t>
+            </w:r>
+          </w:p>
+        </w:tc>
+        <w:tc>
+          <w:tcPr>
+            <w:tcW w:type="dxa" w:w="2409"/>
+            <w:tcBorders>
+              <w:top w:val="none" w:color="FFFFFF" w:sz="0"/>
+              <w:left w:val="none" w:color="FFFFFF" w:sz="0"/>
+              <w:bottom w:val="single" w:color="DDE0E5" w:sz="4"/>
+              <w:right w:val="none" w:color="FFFFFF" w:sz="0"/>
+            </w:tcBorders>
+            <w:tcMar>
+              <w:top w:type="dxa" w:w="100"/>
+              <w:left w:type="dxa" w:w="120"/>
+              <w:bottom w:type="dxa" w:w="100"/>
+              <w:right w:type="dxa" w:w="120"/>
+            </w:tcMar>
+          </w:tcPr>
+          <w:p>
+            <w:pPr>
+              <w:spacing w:line="270"/>
+            </w:pPr>
+            <w:r>
+              <w:rPr>
+                <w:sz w:val="19"/>
+                <w:szCs w:val="19"/>
+              </w:rPr>
+              <w:t xml:space="preserve">«Descarga el albarán y compáralo con el del proveedor»</w:t>
+            </w:r>
+          </w:p>
+        </w:tc>
+        <w:tc>
+          <w:tcPr>
+            <w:tcW w:type="dxa" w:w="2226"/>
+            <w:tcBorders>
+              <w:top w:val="none" w:color="FFFFFF" w:sz="0"/>
+              <w:left w:val="none" w:color="FFFFFF" w:sz="0"/>
+              <w:bottom w:val="single" w:color="DDE0E5" w:sz="4"/>
+              <w:right w:val="none" w:color="FFFFFF" w:sz="0"/>
+            </w:tcBorders>
+            <w:tcMar>
+              <w:top w:type="dxa" w:w="100"/>
+              <w:left w:type="dxa" w:w="120"/>
+              <w:bottom w:type="dxa" w:w="100"/>
+              <w:right w:type="dxa" w:w="120"/>
+            </w:tcMar>
+          </w:tcPr>
+          <w:p>
+            <w:pPr>
+              <w:spacing w:line="270"/>
+            </w:pPr>
+            <w:r>
+              <w:rPr>
+                <w:b/>
+                <w:bCs/>
+                <w:sz w:val="19"/>
+                <w:szCs w:val="19"/>
+              </w:rPr>
+              <w:t xml:space="preserve">Fase 1 (ahora), con OK de IT por persona</w:t>
+            </w:r>
+          </w:p>
+        </w:tc>
+      </w:tr>
+      <w:tr>
+        <w:trPr>
+          <w:cantSplit/>
+        </w:trPr>
+        <w:tc>
+          <w:tcPr>
+            <w:tcW w:type="dxa" w:w="2038"/>
+            <w:tcBorders>
+              <w:top w:val="none" w:color="FFFFFF" w:sz="0"/>
+              <w:left w:val="none" w:color="FFFFFF" w:sz="0"/>
+              <w:bottom w:val="single" w:color="DDE0E5" w:sz="4"/>
+              <w:right w:val="none" w:color="FFFFFF" w:sz="0"/>
+            </w:tcBorders>
+            <w:tcMar>
+              <w:top w:type="dxa" w:w="100"/>
+              <w:left w:type="dxa" w:w="120"/>
+              <w:bottom w:type="dxa" w:w="100"/>
+              <w:right w:type="dxa" w:w="120"/>
+            </w:tcMar>
+          </w:tcPr>
+          <w:p>
+            <w:pPr>
+              <w:spacing w:line="270"/>
+            </w:pPr>
+            <w:r>
+              <w:rPr>
+                <w:b/>
+                <w:bCs/>
+                <w:sz w:val="19"/>
+                <w:szCs w:val="19"/>
+              </w:rPr>
+              <w:t xml:space="preserve">3 · Rutinas</w:t>
+            </w:r>
+          </w:p>
+        </w:tc>
+        <w:tc>
+          <w:tcPr>
+            <w:tcW w:type="dxa" w:w="2965"/>
+            <w:tcBorders>
+              <w:top w:val="none" w:color="FFFFFF" w:sz="0"/>
+              <w:left w:val="none" w:color="FFFFFF" w:sz="0"/>
+              <w:bottom w:val="single" w:color="DDE0E5" w:sz="4"/>
+              <w:right w:val="none" w:color="FFFFFF" w:sz="0"/>
+            </w:tcBorders>
+            <w:tcMar>
+              <w:top w:type="dxa" w:w="100"/>
+              <w:left w:type="dxa" w:w="120"/>
+              <w:bottom w:type="dxa" w:w="100"/>
+              <w:right w:type="dxa" w:w="120"/>
+            </w:tcMar>
+          </w:tcPr>
+          <w:p>
+            <w:pPr>
+              <w:spacing w:line="270"/>
+            </w:pPr>
+            <w:r>
+              <w:rPr>
+                <w:sz w:val="19"/>
+                <w:szCs w:val="19"/>
+              </w:rPr>
+              <w:t xml:space="preserve">Tareas que se repiten solas cada semana o cada mes.</w:t>
+            </w:r>
+          </w:p>
+        </w:tc>
+        <w:tc>
+          <w:tcPr>
+            <w:tcW w:type="dxa" w:w="2409"/>
+            <w:tcBorders>
+              <w:top w:val="none" w:color="FFFFFF" w:sz="0"/>
+              <w:left w:val="none" w:color="FFFFFF" w:sz="0"/>
+              <w:bottom w:val="single" w:color="DDE0E5" w:sz="4"/>
+              <w:right w:val="none" w:color="FFFFFF" w:sz="0"/>
+            </w:tcBorders>
+            <w:tcMar>
+              <w:top w:type="dxa" w:w="100"/>
+              <w:left w:type="dxa" w:w="120"/>
+              <w:bottom w:type="dxa" w:w="100"/>
+              <w:right w:type="dxa" w:w="120"/>
+            </w:tcMar>
+          </w:tcPr>
+          <w:p>
+            <w:pPr>
+              <w:spacing w:line="270"/>
+            </w:pPr>
+            <w:r>
+              <w:rPr>
+                <w:sz w:val="19"/>
+                <w:szCs w:val="19"/>
+              </w:rPr>
+              <w:t xml:space="preserve">«Cada lunes, saca el informe de litigios y dime las diferencias»</w:t>
+            </w:r>
+          </w:p>
+        </w:tc>
+        <w:tc>
+          <w:tcPr>
+            <w:tcW w:type="dxa" w:w="2226"/>
+            <w:tcBorders>
+              <w:top w:val="none" w:color="FFFFFF" w:sz="0"/>
+              <w:left w:val="none" w:color="FFFFFF" w:sz="0"/>
+              <w:bottom w:val="single" w:color="DDE0E5" w:sz="4"/>
+              <w:right w:val="none" w:color="FFFFFF" w:sz="0"/>
+            </w:tcBorders>
+            <w:tcMar>
+              <w:top w:type="dxa" w:w="100"/>
+              <w:left w:type="dxa" w:w="120"/>
+              <w:bottom w:type="dxa" w:w="100"/>
+              <w:right w:type="dxa" w:w="120"/>
+            </w:tcMar>
+          </w:tcPr>
+          <w:p>
+            <w:pPr>
+              <w:spacing w:line="270"/>
+            </w:pPr>
+            <w:r>
+              <w:rPr>
+                <w:b/>
+                <w:bCs/>
+                <w:sz w:val="19"/>
+                <w:szCs w:val="19"/>
+              </w:rPr>
+              <w:t xml:space="preserve">Cuando 1 y 2 lleven un tiempo sin incidencias</w:t>
+            </w:r>
+          </w:p>
+        </w:tc>
+      </w:tr>
+      <w:tr>
+        <w:trPr>
+          <w:cantSplit/>
+        </w:trPr>
+        <w:tc>
+          <w:tcPr>
+            <w:tcW w:type="dxa" w:w="2038"/>
+            <w:tcBorders>
+              <w:top w:val="none" w:color="FFFFFF" w:sz="0"/>
+              <w:left w:val="none" w:color="FFFFFF" w:sz="0"/>
+              <w:bottom w:val="single" w:color="DDE0E5" w:sz="4"/>
+              <w:right w:val="none" w:color="FFFFFF" w:sz="0"/>
+            </w:tcBorders>
+            <w:tcMar>
+              <w:top w:type="dxa" w:w="100"/>
+              <w:left w:type="dxa" w:w="120"/>
+              <w:bottom w:type="dxa" w:w="100"/>
+              <w:right w:type="dxa" w:w="120"/>
+            </w:tcMar>
+          </w:tcPr>
+          <w:p>
+            <w:pPr>
+              <w:spacing w:line="270"/>
+            </w:pPr>
+            <w:r>
+              <w:rPr>
+                <w:b/>
+                <w:bCs/>
+                <w:sz w:val="19"/>
+                <w:szCs w:val="19"/>
+              </w:rPr>
+              <w:t xml:space="preserve">4 · Cambios controlados</w:t>
+            </w:r>
+          </w:p>
+        </w:tc>
+        <w:tc>
+          <w:tcPr>
+            <w:tcW w:type="dxa" w:w="2965"/>
+            <w:tcBorders>
+              <w:top w:val="none" w:color="FFFFFF" w:sz="0"/>
+              <w:left w:val="none" w:color="FFFFFF" w:sz="0"/>
+              <w:bottom w:val="single" w:color="DDE0E5" w:sz="4"/>
+              <w:right w:val="none" w:color="FFFFFF" w:sz="0"/>
+            </w:tcBorders>
+            <w:tcMar>
+              <w:top w:type="dxa" w:w="100"/>
+              <w:left w:type="dxa" w:w="120"/>
+              <w:bottom w:type="dxa" w:w="100"/>
+              <w:right w:type="dxa" w:w="120"/>
+            </w:tcMar>
+          </w:tcPr>
+          <w:p>
+            <w:pPr>
+              <w:spacing w:line="270"/>
+            </w:pPr>
+            <w:r>
+              <w:rPr>
+                <w:sz w:val="19"/>
+                <w:szCs w:val="19"/>
+              </w:rPr>
+              <w:t xml:space="preserve">Cambios concretos en una lista cerrada de pantallas, siempre con confirmación.</w:t>
+            </w:r>
+          </w:p>
+        </w:tc>
+        <w:tc>
+          <w:tcPr>
+            <w:tcW w:type="dxa" w:w="2409"/>
+            <w:tcBorders>
+              <w:top w:val="none" w:color="FFFFFF" w:sz="0"/>
+              <w:left w:val="none" w:color="FFFFFF" w:sz="0"/>
+              <w:bottom w:val="single" w:color="DDE0E5" w:sz="4"/>
+              <w:right w:val="none" w:color="FFFFFF" w:sz="0"/>
+            </w:tcBorders>
+            <w:tcMar>
+              <w:top w:type="dxa" w:w="100"/>
+              <w:left w:type="dxa" w:w="120"/>
+              <w:bottom w:type="dxa" w:w="100"/>
+              <w:right w:type="dxa" w:w="120"/>
+            </w:tcMar>
+          </w:tcPr>
+          <w:p>
+            <w:pPr>
+              <w:spacing w:line="270"/>
+            </w:pPr>
+            <w:r>
+              <w:rPr>
+                <w:sz w:val="19"/>
+                <w:szCs w:val="19"/>
+              </w:rPr>
+              <w:t xml:space="preserve">Por decidir</w:t>
+            </w:r>
+          </w:p>
+        </w:tc>
+        <w:tc>
+          <w:tcPr>
+            <w:tcW w:type="dxa" w:w="2226"/>
+            <w:tcBorders>
+              <w:top w:val="none" w:color="FFFFFF" w:sz="0"/>
+              <w:left w:val="none" w:color="FFFFFF" w:sz="0"/>
+              <w:bottom w:val="single" w:color="DDE0E5" w:sz="4"/>
+              <w:right w:val="none" w:color="FFFFFF" w:sz="0"/>
+            </w:tcBorders>
+            <w:tcMar>
+              <w:top w:type="dxa" w:w="100"/>
+              <w:left w:type="dxa" w:w="120"/>
+              <w:bottom w:type="dxa" w:w="100"/>
+              <w:right w:type="dxa" w:w="120"/>
+            </w:tcMar>
+          </w:tcPr>
+          <w:p>
+            <w:pPr>
+              <w:spacing w:line="270"/>
+            </w:pPr>
+            <w:r>
+              <w:rPr>
+                <w:b/>
+                <w:bCs/>
+                <w:sz w:val="19"/>
+                <w:szCs w:val="19"/>
+              </w:rPr>
+              <w:t xml:space="preserve">Dentro de unos meses, solo si todo ha ido bien</w:t>
+            </w:r>
+          </w:p>
+        </w:tc>
+      </w:tr>
+    </w:tbl>
+    <w:p>
+      <w:pPr>
+        <w:spacing w:after="160"/>
+      </w:pPr>
+    </w:p>
+    <w:tbl>
+      <w:tblPr>
+        <w:tblW w:type="dxa" w:w="9638"/>
+        <w:tblBorders>
+          <w:top w:val="single" w:color="auto" w:sz="4"/>
+          <w:left w:val="single" w:color="auto" w:sz="4"/>
+          <w:bottom w:val="single" w:color="auto" w:sz="4"/>
+          <w:right w:val="single" w:color="auto" w:sz="4"/>
+          <w:insideH w:val="single" w:color="auto" w:sz="4"/>
+          <w:insideV w:val="single" w:color="auto" w:sz="4"/>
+        </w:tblBorders>
+      </w:tblPr>
+      <w:tblGrid>
+        <w:gridCol w:w="9638"/>
+      </w:tblGrid>
+      <w:tr>
+        <w:trPr>
+          <w:cantSplit/>
+        </w:trPr>
+        <w:tc>
+          <w:tcPr>
+            <w:tcW w:type="dxa" w:w="9638"/>
+            <w:tcBorders>
+              <w:top w:val="none" w:color="FFFFFF" w:sz="0"/>
+              <w:left w:val="single" w:color="004A98" w:sz="24"/>
+              <w:bottom w:val="none" w:color="FFFFFF" w:sz="0"/>
+              <w:right w:val="none" w:color="FFFFFF" w:sz="0"/>
+            </w:tcBorders>
+            <w:shd w:fill="F3F5F8" w:color="auto" w:val="clear"/>
+            <w:tcMar>
+              <w:top w:type="dxa" w:w="140"/>
+              <w:left w:type="dxa" w:w="220"/>
+              <w:bottom w:type="dxa" w:w="140"/>
+              <w:right w:type="dxa" w:w="220"/>
+            </w:tcMar>
+          </w:tcPr>
+          <w:p>
+            <w:pPr>
+              <w:spacing w:after="0" w:line="290"/>
+            </w:pPr>
+            <w:r>
+              <w:t xml:space="preserve">Se sube de nivel cuando IT lo aprueba.</w:t>
+            </w:r>
+          </w:p>
+        </w:tc>
+      </w:tr>
+    </w:tbl>
+    <w:p>
+      <w:pPr>
+        <w:spacing w:after="160"/>
+      </w:pPr>
+    </w:p>
+    <w:tbl>
+      <w:tblPr>
+        <w:tblW w:type="dxa" w:w="9638"/>
+        <w:tblBorders>
+          <w:top w:val="single" w:color="auto" w:sz="4"/>
+          <w:left w:val="single" w:color="auto" w:sz="4"/>
+          <w:bottom w:val="single" w:color="auto" w:sz="4"/>
+          <w:right w:val="single" w:color="auto" w:sz="4"/>
+          <w:insideH w:val="single" w:color="auto" w:sz="4"/>
+          <w:insideV w:val="single" w:color="auto" w:sz="4"/>
+        </w:tblBorders>
+      </w:tblPr>
+      <w:tblGrid>
+        <w:gridCol w:w="9638"/>
+      </w:tblGrid>
+      <w:tr>
+        <w:trPr>
+          <w:cantSplit/>
+        </w:trPr>
+        <w:tc>
+          <w:tcPr>
+            <w:tcW w:type="dxa" w:w="9638"/>
+            <w:tcBorders>
+              <w:top w:val="none" w:color="FFFFFF" w:sz="0"/>
+              <w:left w:val="single" w:color="CE0E2D" w:sz="24"/>
+              <w:bottom w:val="none" w:color="FFFFFF" w:sz="0"/>
+              <w:right w:val="none" w:color="FFFFFF" w:sz="0"/>
+            </w:tcBorders>
+            <w:shd w:fill="E8EFF8" w:color="auto" w:val="clear"/>
+            <w:tcMar>
+              <w:top w:type="dxa" w:w="140"/>
+              <w:left w:type="dxa" w:w="220"/>
+              <w:bottom w:type="dxa" w:w="140"/>
+              <w:right w:type="dxa" w:w="220"/>
+            </w:tcMar>
+          </w:tcPr>
+          <w:p>
+            <w:pPr>
+              <w:keepNext/>
+              <w:spacing w:after="60" w:before="60"/>
+            </w:pPr>
+            <w:r>
+              <w:rPr>
+                <w:b/>
+                <w:bCs/>
+                <w:color w:val="004A98"/>
+                <w:spacing w:val="30"/>
+                <w:sz w:val="15"/>
+                <w:szCs w:val="15"/>
+              </w:rPr>
+              <w:t xml:space="preserve">NUNCA, EN NINGÚN NIVEL</w:t>
+            </w:r>
+          </w:p>
+          <w:p>
+            <w:pPr>
+              <w:spacing w:after="80" w:line="300"/>
+            </w:pPr>
+            <w:r>
+              <w:rPr>
+                <w:b/>
+                <w:bCs/>
+                <w:color w:val="CE0E2D"/>
+                <w:sz w:val="30"/>
+                <w:szCs w:val="30"/>
+              </w:rPr>
+              <w:t xml:space="preserve">Contabilizar, dar el OK a pagos ni registrar facturas.</w:t>
+            </w:r>
+          </w:p>
+          <w:p>
+            <w:pPr>
+              <w:spacing w:after="0"/>
+            </w:pPr>
+            <w:r>
+              <w:rPr>
+                <w:color w:val="4A5466"/>
+              </w:rPr>
+              <w:t xml:space="preserve">Si se sube mal una tanda de facturas, el problema llega hasta Hacienda.</w:t>
+            </w:r>
+          </w:p>
+        </w:tc>
+      </w:tr>
+    </w:tbl>
+    <w:p>
+      <w:pPr>
+        <w:spacing w:after="160"/>
+      </w:pPr>
+    </w:p>
+    <w:p>
+      <w:pPr>
+        <w:pStyle w:val="Heading2"/>
+      </w:pPr>
+      <w:r>
+        <w:t xml:space="preserve">Barreras y medida</w:t>
+      </w:r>
+    </w:p>
+    <w:p>
+      <w:pPr>
+        <w:pStyle w:val="Heading3"/>
+      </w:pPr>
+      <w:r>
+        <w:t xml:space="preserve">Barreras de seguridad</w:t>
+      </w:r>
+    </w:p>
+    <w:tbl>
+      <w:tblPr>
+        <w:tblW w:type="dxa" w:w="9638"/>
+        <w:tblBorders>
+          <w:top w:val="single" w:color="auto" w:sz="4"/>
+          <w:left w:val="single" w:color="auto" w:sz="4"/>
+          <w:bottom w:val="single" w:color="auto" w:sz="4"/>
+          <w:right w:val="single" w:color="auto" w:sz="4"/>
+          <w:insideH w:val="single" w:color="auto" w:sz="4"/>
+          <w:insideV w:val="single" w:color="auto" w:sz="4"/>
+        </w:tblBorders>
+        <w:tblLayout w:type="fixed"/>
+      </w:tblPr>
+      <w:tblGrid>
+        <w:gridCol w:w="2891"/>
+        <w:gridCol w:w="6747"/>
+      </w:tblGrid>
+      <w:tr>
+        <w:trPr>
+          <w:tblHeader/>
+        </w:trPr>
+        <w:tc>
+          <w:tcPr>
+            <w:tcW w:type="dxa" w:w="2891"/>
+            <w:tcBorders>
+              <w:top w:val="none" w:color="FFFFFF" w:sz="0"/>
+              <w:left w:val="none" w:color="FFFFFF" w:sz="0"/>
+              <w:bottom w:val="single" w:color="004A98" w:sz="10"/>
+              <w:right w:val="none" w:color="FFFFFF" w:sz="0"/>
+            </w:tcBorders>
+            <w:tcMar>
+              <w:top w:type="dxa" w:w="100"/>
+              <w:left w:type="dxa" w:w="120"/>
+              <w:bottom w:type="dxa" w:w="100"/>
+              <w:right w:type="dxa" w:w="120"/>
+            </w:tcMar>
+          </w:tcPr>
+          <w:p>
+            <w:r>
+              <w:rPr>
+                <w:b/>
+                <w:bCs/>
+                <w:color w:val="4A5466"/>
+                <w:sz w:val="15"/>
+                <w:szCs w:val="15"/>
+              </w:rPr>
+              <w:t xml:space="preserve">QUÉ</w:t>
+            </w:r>
+          </w:p>
+        </w:tc>
+        <w:tc>
+          <w:tcPr>
+            <w:tcW w:type="dxa" w:w="6747"/>
+            <w:tcBorders>
+              <w:top w:val="none" w:color="FFFFFF" w:sz="0"/>
+              <w:left w:val="none" w:color="FFFFFF" w:sz="0"/>
+              <w:bottom w:val="single" w:color="004A98" w:sz="10"/>
+              <w:right w:val="none" w:color="FFFFFF" w:sz="0"/>
+            </w:tcBorders>
+            <w:tcMar>
+              <w:top w:type="dxa" w:w="100"/>
+              <w:left w:type="dxa" w:w="120"/>
+              <w:bottom w:type="dxa" w:w="100"/>
+              <w:right w:type="dxa" w:w="120"/>
+            </w:tcMar>
+          </w:tcPr>
+          <w:p>
+            <w:r>
+              <w:rPr>
+                <w:b/>
+                <w:bCs/>
+                <w:color w:val="4A5466"/>
+                <w:sz w:val="15"/>
+                <w:szCs w:val="15"/>
+              </w:rPr>
+              <w:t xml:space="preserve">EN QUÉ CONSISTE</w:t>
+            </w:r>
+          </w:p>
+        </w:tc>
+      </w:tr>
+      <w:tr>
+        <w:trPr>
+          <w:cantSplit/>
+        </w:trPr>
+        <w:tc>
+          <w:tcPr>
+            <w:tcW w:type="dxa" w:w="2891"/>
+            <w:tcBorders>
+              <w:top w:val="none" w:color="FFFFFF" w:sz="0"/>
+              <w:left w:val="none" w:color="FFFFFF" w:sz="0"/>
+              <w:bottom w:val="single" w:color="DDE0E5" w:sz="4"/>
+              <w:right w:val="none" w:color="FFFFFF" w:sz="0"/>
+            </w:tcBorders>
+            <w:tcMar>
+              <w:top w:type="dxa" w:w="100"/>
+              <w:left w:type="dxa" w:w="120"/>
+              <w:bottom w:type="dxa" w:w="100"/>
+              <w:right w:type="dxa" w:w="120"/>
+            </w:tcMar>
+          </w:tcPr>
+          <w:p>
+            <w:pPr>
+              <w:spacing w:line="270"/>
+            </w:pPr>
+            <w:r>
+              <w:rPr>
+                <w:b/>
+                <w:bCs/>
+                <w:sz w:val="19"/>
+                <w:szCs w:val="19"/>
+              </w:rPr>
+              <w:t xml:space="preserve">Su propia carpeta de trabajo</w:t>
+            </w:r>
+          </w:p>
+        </w:tc>
+        <w:tc>
+          <w:tcPr>
+            <w:tcW w:type="dxa" w:w="6747"/>
+            <w:tcBorders>
+              <w:top w:val="none" w:color="FFFFFF" w:sz="0"/>
+              <w:left w:val="none" w:color="FFFFFF" w:sz="0"/>
+              <w:bottom w:val="single" w:color="DDE0E5" w:sz="4"/>
+              <w:right w:val="none" w:color="FFFFFF" w:sz="0"/>
+            </w:tcBorders>
+            <w:tcMar>
+              <w:top w:type="dxa" w:w="100"/>
+              <w:left w:type="dxa" w:w="120"/>
+              <w:bottom w:type="dxa" w:w="100"/>
+              <w:right w:type="dxa" w:w="120"/>
+            </w:tcMar>
+          </w:tcPr>
+          <w:p>
+            <w:pPr>
+              <w:spacing w:line="270"/>
+            </w:pPr>
+            <w:r>
+              <w:rPr>
+                <w:sz w:val="19"/>
+                <w:szCs w:val="19"/>
+              </w:rPr>
+              <w:t xml:space="preserve">Claude descarga ahí, nunca en las carpetas oficiales. La persona revisa y mueve ella el resultado a la oficial.</w:t>
+            </w:r>
+          </w:p>
+        </w:tc>
+      </w:tr>
+      <w:tr>
+        <w:trPr>
+          <w:cantSplit/>
+        </w:trPr>
+        <w:tc>
+          <w:tcPr>
+            <w:tcW w:type="dxa" w:w="2891"/>
+            <w:tcBorders>
+              <w:top w:val="none" w:color="FFFFFF" w:sz="0"/>
+              <w:left w:val="none" w:color="FFFFFF" w:sz="0"/>
+              <w:bottom w:val="single" w:color="DDE0E5" w:sz="4"/>
+              <w:right w:val="none" w:color="FFFFFF" w:sz="0"/>
+            </w:tcBorders>
+            <w:tcMar>
+              <w:top w:type="dxa" w:w="100"/>
+              <w:left w:type="dxa" w:w="120"/>
+              <w:bottom w:type="dxa" w:w="100"/>
+              <w:right w:type="dxa" w:w="120"/>
+            </w:tcMar>
+          </w:tcPr>
+          <w:p>
+            <w:pPr>
+              <w:spacing w:line="270"/>
+            </w:pPr>
+            <w:r>
+              <w:rPr>
+                <w:b/>
+                <w:bCs/>
+                <w:sz w:val="19"/>
+                <w:szCs w:val="19"/>
+              </w:rPr>
+              <w:t xml:space="preserve">Poco a poco</w:t>
+            </w:r>
+          </w:p>
+        </w:tc>
+        <w:tc>
+          <w:tcPr>
+            <w:tcW w:type="dxa" w:w="6747"/>
+            <w:tcBorders>
+              <w:top w:val="none" w:color="FFFFFF" w:sz="0"/>
+              <w:left w:val="none" w:color="FFFFFF" w:sz="0"/>
+              <w:bottom w:val="single" w:color="DDE0E5" w:sz="4"/>
+              <w:right w:val="none" w:color="FFFFFF" w:sz="0"/>
+            </w:tcBorders>
+            <w:tcMar>
+              <w:top w:type="dxa" w:w="100"/>
+              <w:left w:type="dxa" w:w="120"/>
+              <w:bottom w:type="dxa" w:w="100"/>
+              <w:right w:type="dxa" w:w="120"/>
+            </w:tcMar>
+          </w:tcPr>
+          <w:p>
+            <w:pPr>
+              <w:spacing w:line="270"/>
+            </w:pPr>
+            <w:r>
+              <w:rPr>
+                <w:sz w:val="19"/>
+                <w:szCs w:val="19"/>
+              </w:rPr>
+              <w:t xml:space="preserve">Primero pocas personas, de recepción y almacén. Revisión a los pocos meses: solo se amplía si no hay incidencias.</w:t>
+            </w:r>
+          </w:p>
+        </w:tc>
+      </w:tr>
+      <w:tr>
+        <w:trPr>
+          <w:cantSplit/>
+        </w:trPr>
+        <w:tc>
+          <w:tcPr>
+            <w:tcW w:type="dxa" w:w="2891"/>
+            <w:tcBorders>
+              <w:top w:val="none" w:color="FFFFFF" w:sz="0"/>
+              <w:left w:val="none" w:color="FFFFFF" w:sz="0"/>
+              <w:bottom w:val="single" w:color="DDE0E5" w:sz="4"/>
+              <w:right w:val="none" w:color="FFFFFF" w:sz="0"/>
+            </w:tcBorders>
+            <w:tcMar>
+              <w:top w:type="dxa" w:w="100"/>
+              <w:left w:type="dxa" w:w="120"/>
+              <w:bottom w:type="dxa" w:w="100"/>
+              <w:right w:type="dxa" w:w="120"/>
+            </w:tcMar>
+          </w:tcPr>
+          <w:p>
+            <w:pPr>
+              <w:spacing w:line="270"/>
+            </w:pPr>
+            <w:r>
+              <w:rPr>
+                <w:b/>
+                <w:bCs/>
+                <w:sz w:val="19"/>
+                <w:szCs w:val="19"/>
+              </w:rPr>
+              <w:t xml:space="preserve">Nunca contabilizar</w:t>
+            </w:r>
+          </w:p>
+        </w:tc>
+        <w:tc>
+          <w:tcPr>
+            <w:tcW w:type="dxa" w:w="6747"/>
+            <w:tcBorders>
+              <w:top w:val="none" w:color="FFFFFF" w:sz="0"/>
+              <w:left w:val="none" w:color="FFFFFF" w:sz="0"/>
+              <w:bottom w:val="single" w:color="DDE0E5" w:sz="4"/>
+              <w:right w:val="none" w:color="FFFFFF" w:sz="0"/>
+            </w:tcBorders>
+            <w:tcMar>
+              <w:top w:type="dxa" w:w="100"/>
+              <w:left w:type="dxa" w:w="120"/>
+              <w:bottom w:type="dxa" w:w="100"/>
+              <w:right w:type="dxa" w:w="120"/>
+            </w:tcMar>
+          </w:tcPr>
+          <w:p>
+            <w:pPr>
+              <w:spacing w:line="270"/>
+            </w:pPr>
+            <w:r>
+              <w:rPr>
+                <w:sz w:val="19"/>
+                <w:szCs w:val="19"/>
+              </w:rPr>
+              <w:t xml:space="preserve">Ni registrar facturas ni dar el OK a pagos, en ninguna fase.</w:t>
+            </w:r>
+          </w:p>
+        </w:tc>
+      </w:tr>
+    </w:tbl>
+    <w:p>
+      <w:pPr>
+        <w:spacing w:after="160"/>
+      </w:pPr>
+    </w:p>
+    <w:p>
+      <w:pPr>
+        <w:pStyle w:val="Heading3"/>
+      </w:pPr>
+      <w:r>
+        <w:t xml:space="preserve">Cómo lo mediremos</w:t>
+      </w:r>
+    </w:p>
+    <w:tbl>
+      <w:tblPr>
+        <w:tblW w:type="dxa" w:w="9638"/>
+        <w:tblBorders>
+          <w:top w:val="single" w:color="auto" w:sz="4"/>
+          <w:left w:val="single" w:color="auto" w:sz="4"/>
+          <w:bottom w:val="single" w:color="auto" w:sz="4"/>
+          <w:right w:val="single" w:color="auto" w:sz="4"/>
+          <w:insideH w:val="single" w:color="auto" w:sz="4"/>
+          <w:insideV w:val="single" w:color="auto" w:sz="4"/>
+        </w:tblBorders>
+        <w:tblLayout w:type="fixed"/>
+      </w:tblPr>
+      <w:tblGrid>
+        <w:gridCol w:w="2891"/>
+        <w:gridCol w:w="6747"/>
+      </w:tblGrid>
+      <w:tr>
+        <w:trPr>
+          <w:tblHeader/>
+        </w:trPr>
+        <w:tc>
+          <w:tcPr>
+            <w:tcW w:type="dxa" w:w="2891"/>
+            <w:tcBorders>
+              <w:top w:val="none" w:color="FFFFFF" w:sz="0"/>
+              <w:left w:val="none" w:color="FFFFFF" w:sz="0"/>
+              <w:bottom w:val="single" w:color="004A98" w:sz="10"/>
+              <w:right w:val="none" w:color="FFFFFF" w:sz="0"/>
+            </w:tcBorders>
+            <w:tcMar>
+              <w:top w:type="dxa" w:w="100"/>
+              <w:left w:type="dxa" w:w="120"/>
+              <w:bottom w:type="dxa" w:w="100"/>
+              <w:right w:type="dxa" w:w="120"/>
+            </w:tcMar>
+          </w:tcPr>
+          <w:p>
+            <w:r>
+              <w:rPr>
+                <w:b/>
+                <w:bCs/>
+                <w:color w:val="4A5466"/>
+                <w:sz w:val="15"/>
+                <w:szCs w:val="15"/>
+              </w:rPr>
+              <w:t xml:space="preserve">QUÉ</w:t>
+            </w:r>
+          </w:p>
+        </w:tc>
+        <w:tc>
+          <w:tcPr>
+            <w:tcW w:type="dxa" w:w="6747"/>
+            <w:tcBorders>
+              <w:top w:val="none" w:color="FFFFFF" w:sz="0"/>
+              <w:left w:val="none" w:color="FFFFFF" w:sz="0"/>
+              <w:bottom w:val="single" w:color="004A98" w:sz="10"/>
+              <w:right w:val="none" w:color="FFFFFF" w:sz="0"/>
+            </w:tcBorders>
+            <w:tcMar>
+              <w:top w:type="dxa" w:w="100"/>
+              <w:left w:type="dxa" w:w="120"/>
+              <w:bottom w:type="dxa" w:w="100"/>
+              <w:right w:type="dxa" w:w="120"/>
+            </w:tcMar>
+          </w:tcPr>
+          <w:p>
+            <w:r>
+              <w:rPr>
+                <w:b/>
+                <w:bCs/>
+                <w:color w:val="4A5466"/>
+                <w:sz w:val="15"/>
+                <w:szCs w:val="15"/>
+              </w:rPr>
+              <w:t xml:space="preserve">EN QUÉ CONSISTE</w:t>
+            </w:r>
+          </w:p>
+        </w:tc>
+      </w:tr>
+      <w:tr>
+        <w:trPr>
+          <w:cantSplit/>
+        </w:trPr>
+        <w:tc>
+          <w:tcPr>
+            <w:tcW w:type="dxa" w:w="2891"/>
+            <w:tcBorders>
+              <w:top w:val="none" w:color="FFFFFF" w:sz="0"/>
+              <w:left w:val="none" w:color="FFFFFF" w:sz="0"/>
+              <w:bottom w:val="single" w:color="DDE0E5" w:sz="4"/>
+              <w:right w:val="none" w:color="FFFFFF" w:sz="0"/>
+            </w:tcBorders>
+            <w:tcMar>
+              <w:top w:type="dxa" w:w="100"/>
+              <w:left w:type="dxa" w:w="120"/>
+              <w:bottom w:type="dxa" w:w="100"/>
+              <w:right w:type="dxa" w:w="120"/>
+            </w:tcMar>
+          </w:tcPr>
+          <w:p>
+            <w:pPr>
+              <w:spacing w:line="270"/>
+            </w:pPr>
+            <w:r>
+              <w:rPr>
+                <w:b/>
+                <w:bCs/>
+                <w:sz w:val="19"/>
+                <w:szCs w:val="19"/>
+              </w:rPr>
+              <w:t xml:space="preserve">Tiempo</w:t>
+            </w:r>
+          </w:p>
+        </w:tc>
+        <w:tc>
+          <w:tcPr>
+            <w:tcW w:type="dxa" w:w="6747"/>
+            <w:tcBorders>
+              <w:top w:val="none" w:color="FFFFFF" w:sz="0"/>
+              <w:left w:val="none" w:color="FFFFFF" w:sz="0"/>
+              <w:bottom w:val="single" w:color="DDE0E5" w:sz="4"/>
+              <w:right w:val="none" w:color="FFFFFF" w:sz="0"/>
+            </w:tcBorders>
+            <w:tcMar>
+              <w:top w:type="dxa" w:w="100"/>
+              <w:left w:type="dxa" w:w="120"/>
+              <w:bottom w:type="dxa" w:w="100"/>
+              <w:right w:type="dxa" w:w="120"/>
+            </w:tcMar>
+          </w:tcPr>
+          <w:p>
+            <w:pPr>
+              <w:spacing w:line="270"/>
+            </w:pPr>
+            <w:r>
+              <w:rPr>
+                <w:sz w:val="19"/>
+                <w:szCs w:val="19"/>
+              </w:rPr>
+              <w:t xml:space="preserve">Por tarea, antes y después: buscar un albarán, cruzar un informe, preparar el de litigios.</w:t>
+            </w:r>
+          </w:p>
+        </w:tc>
+      </w:tr>
+      <w:tr>
+        <w:trPr>
+          <w:cantSplit/>
+        </w:trPr>
+        <w:tc>
+          <w:tcPr>
+            <w:tcW w:type="dxa" w:w="2891"/>
+            <w:tcBorders>
+              <w:top w:val="none" w:color="FFFFFF" w:sz="0"/>
+              <w:left w:val="none" w:color="FFFFFF" w:sz="0"/>
+              <w:bottom w:val="single" w:color="DDE0E5" w:sz="4"/>
+              <w:right w:val="none" w:color="FFFFFF" w:sz="0"/>
+            </w:tcBorders>
+            <w:tcMar>
+              <w:top w:type="dxa" w:w="100"/>
+              <w:left w:type="dxa" w:w="120"/>
+              <w:bottom w:type="dxa" w:w="100"/>
+              <w:right w:type="dxa" w:w="120"/>
+            </w:tcMar>
+          </w:tcPr>
+          <w:p>
+            <w:pPr>
+              <w:spacing w:line="270"/>
+            </w:pPr>
+            <w:r>
+              <w:rPr>
+                <w:b/>
+                <w:bCs/>
+                <w:sz w:val="19"/>
+                <w:szCs w:val="19"/>
+              </w:rPr>
+              <w:t xml:space="preserve">Incidencias</w:t>
+            </w:r>
+          </w:p>
+        </w:tc>
+        <w:tc>
+          <w:tcPr>
+            <w:tcW w:type="dxa" w:w="6747"/>
+            <w:tcBorders>
+              <w:top w:val="none" w:color="FFFFFF" w:sz="0"/>
+              <w:left w:val="none" w:color="FFFFFF" w:sz="0"/>
+              <w:bottom w:val="single" w:color="DDE0E5" w:sz="4"/>
+              <w:right w:val="none" w:color="FFFFFF" w:sz="0"/>
+            </w:tcBorders>
+            <w:tcMar>
+              <w:top w:type="dxa" w:w="100"/>
+              <w:left w:type="dxa" w:w="120"/>
+              <w:bottom w:type="dxa" w:w="100"/>
+              <w:right w:type="dxa" w:w="120"/>
+            </w:tcMar>
+          </w:tcPr>
+          <w:p>
+            <w:pPr>
+              <w:spacing w:line="270"/>
+            </w:pPr>
+            <w:r>
+              <w:rPr>
+                <w:sz w:val="19"/>
+                <w:szCs w:val="19"/>
+              </w:rPr>
+              <w:t xml:space="preserve">Errores o vueltas atrás. Objetivo: cero.</w:t>
+            </w:r>
+          </w:p>
+        </w:tc>
+      </w:tr>
+      <w:tr>
+        <w:trPr>
+          <w:cantSplit/>
+        </w:trPr>
+        <w:tc>
+          <w:tcPr>
+            <w:tcW w:type="dxa" w:w="2891"/>
+            <w:tcBorders>
+              <w:top w:val="none" w:color="FFFFFF" w:sz="0"/>
+              <w:left w:val="none" w:color="FFFFFF" w:sz="0"/>
+              <w:bottom w:val="single" w:color="DDE0E5" w:sz="4"/>
+              <w:right w:val="none" w:color="FFFFFF" w:sz="0"/>
+            </w:tcBorders>
+            <w:tcMar>
+              <w:top w:type="dxa" w:w="100"/>
+              <w:left w:type="dxa" w:w="120"/>
+              <w:bottom w:type="dxa" w:w="100"/>
+              <w:right w:type="dxa" w:w="120"/>
+            </w:tcMar>
+          </w:tcPr>
+          <w:p>
+            <w:pPr>
+              <w:spacing w:line="270"/>
+            </w:pPr>
+            <w:r>
+              <w:rPr>
+                <w:b/>
+                <w:bCs/>
+                <w:sz w:val="19"/>
+                <w:szCs w:val="19"/>
+              </w:rPr>
+              <w:t xml:space="preserve">Uso</w:t>
+            </w:r>
+          </w:p>
+        </w:tc>
+        <w:tc>
+          <w:tcPr>
+            <w:tcW w:type="dxa" w:w="6747"/>
+            <w:tcBorders>
+              <w:top w:val="none" w:color="FFFFFF" w:sz="0"/>
+              <w:left w:val="none" w:color="FFFFFF" w:sz="0"/>
+              <w:bottom w:val="single" w:color="DDE0E5" w:sz="4"/>
+              <w:right w:val="none" w:color="FFFFFF" w:sz="0"/>
+            </w:tcBorders>
+            <w:tcMar>
+              <w:top w:type="dxa" w:w="100"/>
+              <w:left w:type="dxa" w:w="120"/>
+              <w:bottom w:type="dxa" w:w="100"/>
+              <w:right w:type="dxa" w:w="120"/>
+            </w:tcMar>
+          </w:tcPr>
+          <w:p>
+            <w:pPr>
+              <w:spacing w:line="270"/>
+            </w:pPr>
+            <w:r>
+              <w:rPr>
+                <w:sz w:val="19"/>
+                <w:szCs w:val="19"/>
+              </w:rPr>
+              <w:t xml:space="preserve">Consultas y descargas por persona y semana.</w:t>
+            </w:r>
+          </w:p>
+        </w:tc>
+      </w:tr>
+    </w:tbl>
+    <w:p>
+      <w:pPr>
+        <w:spacing w:after="160"/>
+      </w:pPr>
+    </w:p>
+    <w:p>
+      <w:pPr>
+        <w:pageBreakBefore/>
+        <w:pBdr>
+          <w:top w:val="single" w:color="FFA400" w:sz="36" w:space="14"/>
+        </w:pBdr>
+        <w:spacing w:after="120"/>
+      </w:pPr>
+      <w:r>
+        <w:rPr>
+          <w:b/>
+          <w:bCs/>
+          <w:color w:val="4A5466"/>
+          <w:spacing w:val="40"/>
+          <w:sz w:val="16"/>
+          <w:szCs w:val="16"/>
+        </w:rPr>
+        <w:t xml:space="preserve">PASO 2 · CLAUDE EN CHROME EN SAGE · 3 DE 8</w:t>
       </w:r>
     </w:p>
     <w:p>
@@ -6440,7 +9223,7 @@
           <wp:inline distT="0" distB="0" distL="0" distR="0">
             <wp:extent cx="6096000" cy="3448050"/>
             <wp:effectExtent t="0" r="0" b="0" l="0"/>
-            <wp:docPr id="10" name="La presentación" descr="La presentación" title="La presentación"/>
+            <wp:docPr id="11" name="La presentación" descr="La presentación" title="La presentación"/>
             <wp:cNvGraphicFramePr>
               <a:graphicFrameLocks xmlns:a="http://schemas.openxmlformats.org/drawingml/2006/main" noChangeAspect="1"/>
             </wp:cNvGraphicFramePr>
@@ -6549,7 +9332,7 @@
       <w:pPr>
         <w:pageBreakBefore/>
         <w:pBdr>
-          <w:top w:val="single" w:color="FFA400" w:sz="36" w:space="14"/>
+          <w:top w:val="single" w:color="15171C" w:sz="36" w:space="14"/>
         </w:pBdr>
         <w:spacing w:after="120"/>
       </w:pPr>
@@ -6562,7 +9345,7 @@
           <w:sz w:val="16"/>
           <w:szCs w:val="16"/>
         </w:rPr>
-        <w:t xml:space="preserve">PASO 2 · CLAUDE EN CHROME EN SAGE · 3 DE 7</w:t>
+        <w:t xml:space="preserve">PASO 2 · CLAUDE EN CHROME EN SAGE · 4 DE 8</w:t>
       </w:r>
     </w:p>
     <w:p>
@@ -6595,7 +9378,7 @@
           <wp:inline distT="0" distB="0" distL="0" distR="0">
             <wp:extent cx="6096000" cy="3448050"/>
             <wp:effectExtent t="0" r="0" b="0" l="0"/>
-            <wp:docPr id="11" name="Hasta 5 pantallas a la vez. 8 en picos." descr="Hasta 5 pantallas a la vez. 8 en picos." title="Hasta 5 pantallas a la vez. 8 en picos."/>
+            <wp:docPr id="12" name="Hasta 5 pantallas a la vez. 8 en picos." descr="Hasta 5 pantallas a la vez. 8 en picos." title="Hasta 5 pantallas a la vez. 8 en picos."/>
             <wp:cNvGraphicFramePr>
               <a:graphicFrameLocks xmlns:a="http://schemas.openxmlformats.org/drawingml/2006/main" noChangeAspect="1"/>
             </wp:cNvGraphicFramePr>
@@ -9143,7 +11926,7 @@
       <w:pPr>
         <w:pageBreakBefore/>
         <w:pBdr>
-          <w:top w:val="single" w:color="15171C" w:sz="36" w:space="14"/>
+          <w:top w:val="single" w:color="004A98" w:sz="36" w:space="14"/>
         </w:pBdr>
         <w:spacing w:after="120"/>
       </w:pPr>
@@ -9156,7 +11939,7 @@
           <w:sz w:val="16"/>
           <w:szCs w:val="16"/>
         </w:rPr>
-        <w:t xml:space="preserve">PASO 2 · CLAUDE EN CHROME EN SAGE · 4 DE 7</w:t>
+        <w:t xml:space="preserve">PASO 2 · CLAUDE EN CHROME EN SAGE · 5 DE 8</w:t>
       </w:r>
     </w:p>
     <w:p>
@@ -9189,7 +11972,7 @@
           <wp:inline distT="0" distB="0" distL="0" distR="0">
             <wp:extent cx="6096000" cy="3448050"/>
             <wp:effectExtent t="0" r="0" b="0" l="0"/>
-            <wp:docPr id="12" name="El proyecto «Claude en Chrome · Reynasa»" descr="El proyecto «Claude en Chrome · Reynasa»" title="El proyecto «Claude en Chrome · Reynasa»"/>
+            <wp:docPr id="13" name="El proyecto «Claude en Chrome · Reynasa»" descr="El proyecto «Claude en Chrome · Reynasa»" title="El proyecto «Claude en Chrome · Reynasa»"/>
             <wp:cNvGraphicFramePr>
               <a:graphicFrameLocks xmlns:a="http://schemas.openxmlformats.org/drawingml/2006/main" noChangeAspect="1"/>
             </wp:cNvGraphicFramePr>
@@ -9832,6 +12615,27 @@
               <w:t xml:space="preserve"> · Paso a paso, y lo que hace IT. https://rubeniarey.github.io/transformacion-ia-reynasa/claude-en-chrome-sage/proyecto/COMO-CREAR-EL-PROYECTO.md</w:t>
             </w:r>
           </w:p>
+          <w:p>
+            <w:pPr>
+              <w:spacing w:after="60"/>
+            </w:pPr>
+            <w:r>
+              <w:rPr>
+                <w:b/>
+                <w:bCs/>
+                <w:sz w:val="19"/>
+                <w:szCs w:val="19"/>
+              </w:rPr>
+              <w:t xml:space="preserve">Departamentos y niveles</w:t>
+            </w:r>
+            <w:r>
+              <w:rPr>
+                <w:sz w:val="19"/>
+                <w:szCs w:val="19"/>
+              </w:rPr>
+              <w:t xml:space="preserve"> · Qué haría en cada departamento y con qué acceso. https://rubeniarey.github.io/transformacion-ia-reynasa/claude-en-chrome-sage/proyecto/departamentos-y-niveles.md</w:t>
+            </w:r>
+          </w:p>
         </w:tc>
       </w:tr>
     </w:tbl>
@@ -10193,7 +12997,7 @@
       <w:pPr>
         <w:pageBreakBefore/>
         <w:pBdr>
-          <w:top w:val="single" w:color="004A98" w:sz="36" w:space="14"/>
+          <w:top w:val="single" w:color="CE0E2D" w:sz="36" w:space="14"/>
         </w:pBdr>
         <w:spacing w:after="120"/>
       </w:pPr>
@@ -10206,7 +13010,7 @@
           <w:sz w:val="16"/>
           <w:szCs w:val="16"/>
         </w:rPr>
-        <w:t xml:space="preserve">PASO 2 · CLAUDE EN CHROME EN SAGE · 5 DE 7</w:t>
+        <w:t xml:space="preserve">PASO 2 · CLAUDE EN CHROME EN SAGE · 6 DE 8</w:t>
       </w:r>
     </w:p>
     <w:p>
@@ -10239,7 +13043,7 @@
           <wp:inline distT="0" distB="0" distL="0" distR="0">
             <wp:extent cx="6096000" cy="3448050"/>
             <wp:effectExtent t="0" r="0" b="0" l="0"/>
-            <wp:docPr id="13" name="Tres fases, de menos a más" descr="Tres fases, de menos a más" title="Tres fases, de menos a más"/>
+            <wp:docPr id="14" name="Tres fases, de menos a más" descr="Tres fases, de menos a más" title="Tres fases, de menos a más"/>
             <wp:cNvGraphicFramePr>
               <a:graphicFrameLocks xmlns:a="http://schemas.openxmlformats.org/drawingml/2006/main" noChangeAspect="1"/>
             </wp:cNvGraphicFramePr>
@@ -12439,7 +15243,7 @@
       <w:pPr>
         <w:pageBreakBefore/>
         <w:pBdr>
-          <w:top w:val="single" w:color="CE0E2D" w:sz="36" w:space="14"/>
+          <w:top w:val="single" w:color="FFA400" w:sz="36" w:space="14"/>
         </w:pBdr>
         <w:spacing w:after="120"/>
       </w:pPr>
@@ -12452,7 +15256,7 @@
           <w:sz w:val="16"/>
           <w:szCs w:val="16"/>
         </w:rPr>
-        <w:t xml:space="preserve">PASO 2 · CLAUDE EN CHROME EN SAGE · 6 DE 7</w:t>
+        <w:t xml:space="preserve">PASO 2 · CLAUDE EN CHROME EN SAGE · 7 DE 8</w:t>
       </w:r>
     </w:p>
     <w:p>
@@ -12460,7 +15264,7 @@
         <w:pStyle w:val="Heading1"/>
       </w:pPr>
       <w:r>
-        <w:t xml:space="preserve">Siete normas de uso</w:t>
+        <w:t xml:space="preserve">Diez normas de uso</w:t>
       </w:r>
     </w:p>
     <w:p>
@@ -12485,7 +15289,7 @@
           <wp:inline distT="0" distB="0" distL="0" distR="0">
             <wp:extent cx="6096000" cy="3448050"/>
             <wp:effectExtent t="0" r="0" b="0" l="0"/>
-            <wp:docPr id="14" name="Siete normas de uso" descr="Siete normas de uso" title="Siete normas de uso"/>
+            <wp:docPr id="15" name="Diez normas de uso" descr="Diez normas de uso" title="Diez normas de uso"/>
             <wp:cNvGraphicFramePr>
               <a:graphicFrameLocks xmlns:a="http://schemas.openxmlformats.org/drawingml/2006/main" noChangeAspect="1"/>
             </wp:cNvGraphicFramePr>
@@ -12692,6 +15496,75 @@
     </w:p>
     <w:p>
       <w:pPr>
+        <w:pStyle w:val="ListParagraph"/>
+        <w:numPr>
+          <w:ilvl w:val="0"/>
+          <w:numId w:val="9"/>
+        </w:numPr>
+        <w:spacing w:after="80" w:line="290"/>
+      </w:pPr>
+      <w:r>
+        <w:rPr>
+          <w:b/>
+          <w:bCs/>
+        </w:rPr>
+        <w:t xml:space="preserve">Descarga solo en tu carpeta de trabajo</w:t>
+      </w:r>
+      <w:r>
+        <w:t xml:space="preserve">  </w:t>
+      </w:r>
+      <w:r>
+        <w:t xml:space="preserve">Nunca en las carpetas oficiales. Tú revisas el resultado y lo mueves a la oficial.</w:t>
+      </w:r>
+    </w:p>
+    <w:p>
+      <w:pPr>
+        <w:pStyle w:val="ListParagraph"/>
+        <w:numPr>
+          <w:ilvl w:val="0"/>
+          <w:numId w:val="9"/>
+        </w:numPr>
+        <w:spacing w:after="80" w:line="290"/>
+      </w:pPr>
+      <w:r>
+        <w:rPr>
+          <w:b/>
+          <w:bCs/>
+        </w:rPr>
+        <w:t xml:space="preserve">En otras webs de la empresa, las mismas normas</w:t>
+      </w:r>
+      <w:r>
+        <w:t xml:space="preserve">  </w:t>
+      </w:r>
+      <w:r>
+        <w:t xml:space="preserve">Expert SGA, NextShop, Drive…: consultar, descargar y comparar, nunca cambiar.</w:t>
+      </w:r>
+    </w:p>
+    <w:p>
+      <w:pPr>
+        <w:pStyle w:val="ListParagraph"/>
+        <w:numPr>
+          <w:ilvl w:val="0"/>
+          <w:numId w:val="9"/>
+        </w:numPr>
+        <w:spacing w:after="80" w:line="290"/>
+      </w:pPr>
+      <w:r>
+        <w:rPr>
+          <w:b/>
+          <w:bCs/>
+        </w:rPr>
+        <w:t xml:space="preserve">Nunca contabilizar, registrar facturas ni dar el OK a pagos</w:t>
+      </w:r>
+      <w:r>
+        <w:t xml:space="preserve">  </w:t>
+      </w:r>
+      <w:r>
+        <w:t xml:space="preserve">En ninguna fase.</w:t>
+      </w:r>
+    </w:p>
+    <w:p>
+      <w:pPr>
         <w:spacing w:after="80"/>
       </w:pPr>
     </w:p>
@@ -12828,15 +15701,7 @@
         <w:t xml:space="preserve">☐  </w:t>
       </w:r>
       <w:r>
-        <w:t xml:space="preserve">Reviso lo que hace</w:t>
-      </w:r>
-    </w:p>
-    <w:p>
-      <w:pPr>
-        <w:pStyle w:val="Heading3"/>
-      </w:pPr>
-      <w:r>
-        <w:t xml:space="preserve">Al acabar</w:t>
+        <w:t xml:space="preserve">Descarga en mi carpeta de trabajo</w:t>
       </w:r>
     </w:p>
     <w:p>
@@ -12852,7 +15717,15 @@
         <w:t xml:space="preserve">☐  </w:t>
       </w:r>
       <w:r>
-        <w:t xml:space="preserve">Salgo de cada pantalla con el botón de salir de Sage</w:t>
+        <w:t xml:space="preserve">Reviso lo que hace</w:t>
+      </w:r>
+    </w:p>
+    <w:p>
+      <w:pPr>
+        <w:pStyle w:val="Heading3"/>
+      </w:pPr>
+      <w:r>
+        <w:t xml:space="preserve">Al acabar</w:t>
       </w:r>
     </w:p>
     <w:p>
@@ -12868,6 +15741,38 @@
         <w:t xml:space="preserve">☐  </w:t>
       </w:r>
       <w:r>
+        <w:t xml:space="preserve">Muevo yo el resultado a la carpeta oficial</w:t>
+      </w:r>
+    </w:p>
+    <w:p>
+      <w:pPr>
+        <w:spacing w:after="80"/>
+        <w:ind w:left="360" w:hanging="360"/>
+      </w:pPr>
+      <w:r>
+        <w:rPr>
+          <w:sz w:val="24"/>
+          <w:szCs w:val="24"/>
+        </w:rPr>
+        <w:t xml:space="preserve">☐  </w:t>
+      </w:r>
+      <w:r>
+        <w:t xml:space="preserve">Salgo de cada pantalla con el botón de salir de Sage</w:t>
+      </w:r>
+    </w:p>
+    <w:p>
+      <w:pPr>
+        <w:spacing w:after="80"/>
+        <w:ind w:left="360" w:hanging="360"/>
+      </w:pPr>
+      <w:r>
+        <w:rPr>
+          <w:sz w:val="24"/>
+          <w:szCs w:val="24"/>
+        </w:rPr>
+        <w:t xml:space="preserve">☐  </w:t>
+      </w:r>
+      <w:r>
         <w:t xml:space="preserve">Después cierro la pestaña</w:t>
       </w:r>
     </w:p>
@@ -12880,7 +15785,7 @@
       <w:pPr>
         <w:pageBreakBefore/>
         <w:pBdr>
-          <w:top w:val="single" w:color="FFA400" w:sz="36" w:space="14"/>
+          <w:top w:val="single" w:color="15171C" w:sz="36" w:space="14"/>
         </w:pBdr>
         <w:spacing w:after="120"/>
       </w:pPr>
@@ -12893,7 +15798,7 @@
           <w:sz w:val="16"/>
           <w:szCs w:val="16"/>
         </w:rPr>
-        <w:t xml:space="preserve">PASO 2 · CLAUDE EN CHROME EN SAGE · 7 DE 7</w:t>
+        <w:t xml:space="preserve">PASO 2 · CLAUDE EN CHROME EN SAGE · 8 DE 8</w:t>
       </w:r>
     </w:p>
     <w:p>
@@ -12926,7 +15831,7 @@
           <wp:inline distT="0" distB="0" distL="0" distR="0">
             <wp:extent cx="6096000" cy="3448050"/>
             <wp:effectExtent t="0" r="0" b="0" l="0"/>
-            <wp:docPr id="15" name="Fuentes" descr="Fuentes" title="Fuentes"/>
+            <wp:docPr id="16" name="Fuentes" descr="Fuentes" title="Fuentes"/>
             <wp:cNvGraphicFramePr>
               <a:graphicFrameLocks xmlns:a="http://schemas.openxmlformats.org/drawingml/2006/main" noChangeAspect="1"/>
             </wp:cNvGraphicFramePr>

</xml_diff>